<commit_message>
Non-destructive docx template (keeps all original formatting); auto Overall Feasibility from RSRP/SINR readings
Co-Authored-By: Claude Sonnet 5 <noreply@anthropic.com>
Claude-Session: https://claude.ai/code/session_01FumjKuHqb2hcHBnB6rY5cR
</commit_message>
<xml_diff>
--- a/template.docx
+++ b/template.docx
@@ -5820,14 +5820,6 @@
           <w:sz w:val="15"/>
         </w:rPr>
         <w:t>Measurements:</w:t>
-        <w:tab/>
-        <w:t>A: {r_top_A}mm</w:t>
-        <w:tab/>
-        <w:t>B: {r_top_B}mm</w:t>
-        <w:tab/>
-        <w:t>C: {r_top_C}mm</w:t>
-        <w:tab/>
-        <w:t>D: {r_top_D}mm</w:t>
       </w:r>
       <w:r>
         <w:rPr>
@@ -5835,6 +5827,7 @@
           <w:color w:val="1563BE"/>
           <w:sz w:val="15"/>
         </w:rPr>
+        <w:tab/>
       </w:r>
       <w:r>
         <w:rPr>
@@ -5843,6 +5836,7 @@
           <w:w w:val="110"/>
           <w:sz w:val="15"/>
         </w:rPr>
+        <w:t>A: {r_top_A}mm</w:t>
       </w:r>
       <w:r>
         <w:rPr>
@@ -5872,6 +5866,7 @@
           <w:color w:val="1563BE"/>
           <w:sz w:val="15"/>
         </w:rPr>
+        <w:tab/>
       </w:r>
       <w:r>
         <w:rPr>
@@ -5880,6 +5875,7 @@
           <w:w w:val="115"/>
           <w:sz w:val="15"/>
         </w:rPr>
+        <w:t>B: {r_top_B}mm</w:t>
       </w:r>
       <w:r>
         <w:rPr>
@@ -5909,6 +5905,7 @@
           <w:color w:val="1563BE"/>
           <w:sz w:val="15"/>
         </w:rPr>
+        <w:tab/>
       </w:r>
       <w:r>
         <w:rPr>
@@ -5917,6 +5914,7 @@
           <w:w w:val="110"/>
           <w:sz w:val="15"/>
         </w:rPr>
+        <w:t>C: {r_top_C}mm</w:t>
       </w:r>
       <w:r>
         <w:rPr>
@@ -5946,6 +5944,7 @@
           <w:color w:val="1563BE"/>
           <w:sz w:val="15"/>
         </w:rPr>
+        <w:tab/>
       </w:r>
       <w:r>
         <w:rPr>
@@ -5954,6 +5953,7 @@
           <w:w w:val="115"/>
           <w:sz w:val="15"/>
         </w:rPr>
+        <w:t>D: {r_top_D}mm</w:t>
       </w:r>
       <w:r>
         <w:rPr>
@@ -5999,10 +5999,6 @@
           <w:sz w:val="15"/>
         </w:rPr>
         <w:t>E: {r_top_E}mm</w:t>
-        <w:tab/>
-        <w:t>F: {r_top_F}mm</w:t>
-        <w:tab/>
-        <w:t>G: {r_top_G}mm</w:t>
       </w:r>
       <w:r>
         <w:rPr>
@@ -6032,6 +6028,7 @@
           <w:color w:val="1563BE"/>
           <w:sz w:val="15"/>
         </w:rPr>
+        <w:tab/>
       </w:r>
       <w:r>
         <w:rPr>
@@ -6039,6 +6036,7 @@
           <w:w w:val="125"/>
           <w:sz w:val="15"/>
         </w:rPr>
+        <w:t>F: {r_top_F}mm</w:t>
       </w:r>
       <w:r>
         <w:rPr>
@@ -6061,6 +6059,7 @@
           <w:color w:val="1563BE"/>
           <w:sz w:val="15"/>
         </w:rPr>
+        <w:tab/>
       </w:r>
       <w:r>
         <w:rPr>
@@ -6068,6 +6067,7 @@
           <w:w w:val="125"/>
           <w:sz w:val="15"/>
         </w:rPr>
+        <w:t>G: {r_top_G}mm</w:t>
       </w:r>
       <w:r>
         <w:rPr>
@@ -7000,14 +7000,6 @@
           <w:sz w:val="15"/>
         </w:rPr>
         <w:t>Measurements:</w:t>
-        <w:tab/>
-        <w:t>A: {r_rear_A}mm</w:t>
-        <w:tab/>
-        <w:t>B: {r_rear_B}mm</w:t>
-        <w:tab/>
-        <w:t>C: {r_rear_C}mm</w:t>
-        <w:tab/>
-        <w:t>D: {r_rear_D}mm</w:t>
       </w:r>
       <w:r>
         <w:rPr>
@@ -7015,6 +7007,7 @@
           <w:color w:val="1563BE"/>
           <w:sz w:val="15"/>
         </w:rPr>
+        <w:tab/>
       </w:r>
       <w:r>
         <w:rPr>
@@ -7023,6 +7016,7 @@
           <w:w w:val="110"/>
           <w:sz w:val="15"/>
         </w:rPr>
+        <w:t>A: {r_rear_A}mm</w:t>
       </w:r>
       <w:r>
         <w:rPr>
@@ -7052,6 +7046,7 @@
           <w:color w:val="1563BE"/>
           <w:sz w:val="15"/>
         </w:rPr>
+        <w:tab/>
       </w:r>
       <w:r>
         <w:rPr>
@@ -7060,6 +7055,7 @@
           <w:w w:val="115"/>
           <w:sz w:val="15"/>
         </w:rPr>
+        <w:t>B: {r_rear_B}mm</w:t>
       </w:r>
       <w:r>
         <w:rPr>
@@ -7089,6 +7085,7 @@
           <w:color w:val="1563BE"/>
           <w:sz w:val="15"/>
         </w:rPr>
+        <w:tab/>
       </w:r>
       <w:r>
         <w:rPr>
@@ -7097,6 +7094,7 @@
           <w:w w:val="110"/>
           <w:sz w:val="15"/>
         </w:rPr>
+        <w:t>C: {r_rear_C}mm</w:t>
       </w:r>
       <w:r>
         <w:rPr>
@@ -7126,6 +7124,7 @@
           <w:color w:val="1563BE"/>
           <w:sz w:val="15"/>
         </w:rPr>
+        <w:tab/>
       </w:r>
       <w:r>
         <w:rPr>
@@ -7134,6 +7133,7 @@
           <w:w w:val="115"/>
           <w:sz w:val="15"/>
         </w:rPr>
+        <w:t>D: {r_rear_D}mm</w:t>
       </w:r>
       <w:r>
         <w:rPr>
@@ -8728,21 +8728,14 @@
                 <w:sz w:val="15"/>
               </w:rPr>
               <w:t>Measurements:</w:t>
+            </w:r>
+            <w:r>
+              <w:rPr>
+                <w:b/>
+                <w:color w:val="1563BE"/>
+                <w:sz w:val="15"/>
+              </w:rPr>
               <w:tab/>
-              <w:t>A: {r_left_A}mm</w:t>
-              <w:tab/>
-              <w:t>B: {r_left_B}mm</w:t>
-              <w:tab/>
-              <w:t>C: {r_left_C}mm</w:t>
-              <w:tab/>
-              <w:t>D: {r_left_D}mm</w:t>
-            </w:r>
-            <w:r>
-              <w:rPr>
-                <w:b/>
-                <w:color w:val="1563BE"/>
-                <w:sz w:val="15"/>
-              </w:rPr>
             </w:r>
             <w:r>
               <w:rPr>
@@ -8751,6 +8744,7 @@
                 <w:w w:val="110"/>
                 <w:sz w:val="15"/>
               </w:rPr>
+              <w:t>A: {r_left_A}mm</w:t>
             </w:r>
             <w:r>
               <w:rPr>
@@ -8780,6 +8774,7 @@
                 <w:color w:val="1563BE"/>
                 <w:sz w:val="15"/>
               </w:rPr>
+              <w:tab/>
             </w:r>
             <w:r>
               <w:rPr>
@@ -8788,6 +8783,7 @@
                 <w:w w:val="115"/>
                 <w:sz w:val="15"/>
               </w:rPr>
+              <w:t>B: {r_left_B}mm</w:t>
             </w:r>
             <w:r>
               <w:rPr>
@@ -8817,6 +8813,7 @@
                 <w:color w:val="1563BE"/>
                 <w:sz w:val="15"/>
               </w:rPr>
+              <w:tab/>
             </w:r>
             <w:r>
               <w:rPr>
@@ -8825,6 +8822,7 @@
                 <w:w w:val="110"/>
                 <w:sz w:val="15"/>
               </w:rPr>
+              <w:t>C: {r_left_C}mm</w:t>
             </w:r>
             <w:r>
               <w:rPr>
@@ -8854,6 +8852,7 @@
                 <w:color w:val="1563BE"/>
                 <w:sz w:val="15"/>
               </w:rPr>
+              <w:tab/>
             </w:r>
             <w:r>
               <w:rPr>
@@ -8862,6 +8861,7 @@
                 <w:w w:val="115"/>
                 <w:sz w:val="15"/>
               </w:rPr>
+              <w:t>D: {r_left_D}mm</w:t>
             </w:r>
             <w:r>
               <w:rPr>
@@ -10102,21 +10102,14 @@
                 <w:sz w:val="15"/>
               </w:rPr>
               <w:t>Measurements:</w:t>
+            </w:r>
+            <w:r>
+              <w:rPr>
+                <w:b/>
+                <w:color w:val="1563BE"/>
+                <w:sz w:val="15"/>
+              </w:rPr>
               <w:tab/>
-              <w:t>A: {r_right_A}mm</w:t>
-              <w:tab/>
-              <w:t>B: {r_right_B}mm</w:t>
-              <w:tab/>
-              <w:t>C: {r_right_C}mm</w:t>
-              <w:tab/>
-              <w:t>D: {r_right_D}mm</w:t>
-            </w:r>
-            <w:r>
-              <w:rPr>
-                <w:b/>
-                <w:color w:val="1563BE"/>
-                <w:sz w:val="15"/>
-              </w:rPr>
             </w:r>
             <w:r>
               <w:rPr>
@@ -10125,6 +10118,7 @@
                 <w:w w:val="110"/>
                 <w:sz w:val="15"/>
               </w:rPr>
+              <w:t>A: {r_right_A}mm</w:t>
             </w:r>
             <w:r>
               <w:rPr>
@@ -10154,6 +10148,7 @@
                 <w:color w:val="1563BE"/>
                 <w:sz w:val="15"/>
               </w:rPr>
+              <w:tab/>
             </w:r>
             <w:r>
               <w:rPr>
@@ -10162,6 +10157,7 @@
                 <w:w w:val="115"/>
                 <w:sz w:val="15"/>
               </w:rPr>
+              <w:t>B: {r_right_B}mm</w:t>
             </w:r>
             <w:r>
               <w:rPr>
@@ -10191,6 +10187,7 @@
                 <w:color w:val="1563BE"/>
                 <w:sz w:val="15"/>
               </w:rPr>
+              <w:tab/>
             </w:r>
             <w:r>
               <w:rPr>
@@ -10199,6 +10196,7 @@
                 <w:w w:val="110"/>
                 <w:sz w:val="15"/>
               </w:rPr>
+              <w:t>C: {r_right_C}mm</w:t>
             </w:r>
             <w:r>
               <w:rPr>
@@ -10228,6 +10226,7 @@
                 <w:color w:val="1563BE"/>
                 <w:sz w:val="15"/>
               </w:rPr>
+              <w:tab/>
             </w:r>
             <w:r>
               <w:rPr>
@@ -10236,6 +10235,7 @@
                 <w:w w:val="115"/>
                 <w:sz w:val="15"/>
               </w:rPr>
+              <w:t>D: {r_right_D}mm</w:t>
             </w:r>
             <w:r>
               <w:rPr>
@@ -14987,8 +14987,32 @@
                 <w:sz w:val="16"/>
               </w:rPr>
             </w:pPr>
-            <w:r>
+          </w:p>
+          <w:p>
+            <w:pPr>
+              <w:pStyle w:val="TableParagraph"/>
+              <w:spacing w:before="0"/>
+              <w:rPr>
+                <w:sz w:val="16"/>
+              </w:rPr>
+            </w:pPr>
+            <w:r>
+              <w:rPr>
+                <w:sz w:val="16"/>
+              </w:rPr>
               <w:t>{btn_sku}</w:t>
+            </w:r>
+            <w:proofErr w:type="spellStart"/>
+            <w:r>
+              <w:rPr>
+                <w:sz w:val="16"/>
+              </w:rPr>
+            </w:r>
+            <w:proofErr w:type="spellEnd"/>
+            <w:r>
+              <w:rPr>
+                <w:sz w:val="16"/>
+              </w:rPr>
             </w:r>
           </w:p>
         </w:tc>
@@ -15717,9 +15741,6 @@
           <w:cols w:space="720"/>
         </w:sectPr>
       </w:pPr>
-      <w:r>
-        <w:br w:type="page"/>
-      </w:r>
       <w:r>
         <w:t xml:space="preserve">{#photos}</w:t>
       </w:r>
@@ -15765,6 +15786,7 @@
                 <w:b/>
                 <w:sz w:val="19"/>
               </w:rPr>
+              <w:pageBreakBefore/>
             </w:pPr>
             <w:r>
               <w:rPr>
@@ -15892,6 +15914,59 @@
               <w:t>{p_desc}</w:t>
             </w:r>
           </w:p>
+          <w:p>
+            <w:pPr>
+              <w:pStyle w:val="TableParagraph"/>
+              <w:spacing w:before="0"/>
+              <w:ind w:left="107"/>
+              <w:rPr>
+                <w:rFonts w:ascii="Cambria"/>
+                <w:sz w:val="20"/>
+              </w:rPr>
+            </w:pPr>
+            <w:r>
+              <w:rPr>
+                <w:rFonts w:ascii="Cambria"/>
+                <w:noProof/>
+                <w:sz w:val="20"/>
+              </w:rPr>
+              <w:drawing>
+                <wp:inline distT="0" distB="0" distL="0" distR="0" wp14:anchorId="2A7ADA46" wp14:editId="4614824D">
+                  <wp:extent cx="2882360" cy="3843147"/>
+                  <wp:effectExtent l="0" t="0" r="0" b="0"/>
+                  <wp:docPr id="66" name="Image 66"/>
+                  <wp:cNvGraphicFramePr>
+                    <a:graphicFrameLocks xmlns:a="http://schemas.openxmlformats.org/drawingml/2006/main"/>
+                  </wp:cNvGraphicFramePr>
+                  <a:graphic xmlns:a="http://schemas.openxmlformats.org/drawingml/2006/main">
+                    <a:graphicData uri="http://schemas.openxmlformats.org/drawingml/2006/picture">
+                      <pic:pic xmlns:pic="http://schemas.openxmlformats.org/drawingml/2006/picture">
+                        <pic:nvPicPr>
+                          <pic:cNvPr id="66" name="Image 66"/>
+                          <pic:cNvPicPr/>
+                        </pic:nvPicPr>
+                        <pic:blipFill>
+                          <a:blip r:embed="rId14" cstate="print"/>
+                          <a:stretch>
+                            <a:fillRect/>
+                          </a:stretch>
+                        </pic:blipFill>
+                        <pic:spPr>
+                          <a:xfrm>
+                            <a:off x="0" y="0"/>
+                            <a:ext cx="2882360" cy="3843147"/>
+                          </a:xfrm>
+                          <a:prstGeom prst="rect">
+                            <a:avLst/>
+                          </a:prstGeom>
+                        </pic:spPr>
+                      </pic:pic>
+                    </a:graphicData>
+                  </a:graphic>
+                </wp:inline>
+              </w:drawing>
+            </w:r>
+          </w:p>
         </w:tc>
         <w:tc>
           <w:tcPr>
@@ -15909,6 +15984,59 @@
             </w:pPr>
             <w:r>
               <w:t>{p_file}</w:t>
+            </w:r>
+          </w:p>
+          <w:p>
+            <w:pPr>
+              <w:pStyle w:val="TableParagraph"/>
+              <w:spacing w:before="0"/>
+              <w:ind w:left="106"/>
+              <w:rPr>
+                <w:rFonts w:ascii="Cambria"/>
+                <w:sz w:val="20"/>
+              </w:rPr>
+            </w:pPr>
+            <w:r>
+              <w:rPr>
+                <w:rFonts w:ascii="Cambria"/>
+                <w:noProof/>
+                <w:sz w:val="20"/>
+              </w:rPr>
+              <w:drawing>
+                <wp:inline distT="0" distB="0" distL="0" distR="0" wp14:anchorId="1BD799C5" wp14:editId="3932CD38">
+                  <wp:extent cx="3210044" cy="4280058"/>
+                  <wp:effectExtent l="0" t="0" r="0" b="0"/>
+                  <wp:docPr id="67" name="Image 67"/>
+                  <wp:cNvGraphicFramePr>
+                    <a:graphicFrameLocks xmlns:a="http://schemas.openxmlformats.org/drawingml/2006/main"/>
+                  </wp:cNvGraphicFramePr>
+                  <a:graphic xmlns:a="http://schemas.openxmlformats.org/drawingml/2006/main">
+                    <a:graphicData uri="http://schemas.openxmlformats.org/drawingml/2006/picture">
+                      <pic:pic xmlns:pic="http://schemas.openxmlformats.org/drawingml/2006/picture">
+                        <pic:nvPicPr>
+                          <pic:cNvPr id="67" name="Image 67"/>
+                          <pic:cNvPicPr/>
+                        </pic:nvPicPr>
+                        <pic:blipFill>
+                          <a:blip r:embed="rId15" cstate="print"/>
+                          <a:stretch>
+                            <a:fillRect/>
+                          </a:stretch>
+                        </pic:blipFill>
+                        <pic:spPr>
+                          <a:xfrm>
+                            <a:off x="0" y="0"/>
+                            <a:ext cx="3210044" cy="4280058"/>
+                          </a:xfrm>
+                          <a:prstGeom prst="rect">
+                            <a:avLst/>
+                          </a:prstGeom>
+                        </pic:spPr>
+                      </pic:pic>
+                    </a:graphicData>
+                  </a:graphic>
+                </wp:inline>
+              </w:drawing>
             </w:r>
           </w:p>
         </w:tc>

</xml_diff>

<commit_message>
Add per-carrier averages tables (RSRP/RSRQ/SINR/DL/UL/Ping + Feasibility) computed from readings; verdict Good/Acceptable/Poor
Co-Authored-By: Claude Sonnet 5 <noreply@anthropic.com>
Claude-Session: https://claude.ai/code/session_01FumjKuHqb2hcHBnB6rY5cR
</commit_message>
<xml_diff>
--- a/template.docx
+++ b/template.docx
@@ -10865,6 +10865,327 @@
         </w:tc>
       </w:tr>
     </w:tbl>
+    <w:tbl>
+      <w:tblPr>
+        <w:tblW w:type="auto" w:w="0"/>
+        <w:tblLook w:firstColumn="1" w:firstRow="1" w:lastColumn="0" w:lastRow="0" w:noHBand="0" w:noVBand="1" w:val="04A0"/>
+      </w:tblPr>
+      <w:tblGrid>
+        <w:gridCol w:w="1215"/>
+        <w:gridCol w:w="1215"/>
+        <w:gridCol w:w="1215"/>
+        <w:gridCol w:w="1215"/>
+        <w:gridCol w:w="1215"/>
+        <w:gridCol w:w="1215"/>
+        <w:gridCol w:w="1215"/>
+        <w:gridCol w:w="1215"/>
+        <w:gridCol w:w="1215"/>
+      </w:tblGrid>
+      <w:tr>
+        <w:tc>
+          <w:tcPr>
+            <w:tcW w:type="dxa" w:w="1215"/>
+          </w:tcPr>
+          <w:p>
+            <w:r>
+              <w:rPr>
+                <w:b/>
+              </w:rPr>
+              <w:t>Operator</w:t>
+            </w:r>
+          </w:p>
+        </w:tc>
+        <w:tc>
+          <w:tcPr>
+            <w:tcW w:type="dxa" w:w="1215"/>
+          </w:tcPr>
+          <w:p>
+            <w:r>
+              <w:rPr>
+                <w:b/>
+              </w:rPr>
+              <w:t>Avg RSRP (dBm)</w:t>
+            </w:r>
+          </w:p>
+        </w:tc>
+        <w:tc>
+          <w:tcPr>
+            <w:tcW w:type="dxa" w:w="1215"/>
+          </w:tcPr>
+          <w:p>
+            <w:r>
+              <w:rPr>
+                <w:b/>
+              </w:rPr>
+              <w:t>Avg RSRQ (dB)</w:t>
+            </w:r>
+          </w:p>
+        </w:tc>
+        <w:tc>
+          <w:tcPr>
+            <w:tcW w:type="dxa" w:w="1215"/>
+          </w:tcPr>
+          <w:p>
+            <w:r>
+              <w:rPr>
+                <w:b/>
+              </w:rPr>
+              <w:t>Avg SINR (dB)</w:t>
+            </w:r>
+          </w:p>
+        </w:tc>
+        <w:tc>
+          <w:tcPr>
+            <w:tcW w:type="dxa" w:w="1215"/>
+          </w:tcPr>
+          <w:p>
+            <w:r>
+              <w:rPr>
+                <w:b/>
+              </w:rPr>
+              <w:t>Avg DL (Mbps)</w:t>
+            </w:r>
+          </w:p>
+        </w:tc>
+        <w:tc>
+          <w:tcPr>
+            <w:tcW w:type="dxa" w:w="1215"/>
+          </w:tcPr>
+          <w:p>
+            <w:r>
+              <w:rPr>
+                <w:b/>
+              </w:rPr>
+              <w:t>Avg UL (Mbps)</w:t>
+            </w:r>
+          </w:p>
+        </w:tc>
+        <w:tc>
+          <w:tcPr>
+            <w:tcW w:type="dxa" w:w="1215"/>
+          </w:tcPr>
+          <w:p>
+            <w:r>
+              <w:rPr>
+                <w:b/>
+              </w:rPr>
+              <w:t>Avg Ping (ms)</w:t>
+            </w:r>
+          </w:p>
+        </w:tc>
+        <w:tc>
+          <w:tcPr>
+            <w:tcW w:type="dxa" w:w="1215"/>
+          </w:tcPr>
+          <w:p>
+            <w:r>
+              <w:rPr>
+                <w:b/>
+              </w:rPr>
+              <w:t>Avg Jitter (ms)</w:t>
+            </w:r>
+          </w:p>
+        </w:tc>
+        <w:tc>
+          <w:tcPr>
+            <w:tcW w:type="dxa" w:w="1215"/>
+          </w:tcPr>
+          <w:p>
+            <w:r>
+              <w:rPr>
+                <w:b/>
+              </w:rPr>
+              <w:t>Feasibility</w:t>
+            </w:r>
+          </w:p>
+        </w:tc>
+      </w:tr>
+      <w:tr>
+        <w:tc>
+          <w:tcPr>
+            <w:tcW w:type="dxa" w:w="1215"/>
+          </w:tcPr>
+          <w:p>
+            <w:r>
+              <w:t>Carrier 1 - du</w:t>
+            </w:r>
+          </w:p>
+        </w:tc>
+        <w:tc>
+          <w:tcPr>
+            <w:tcW w:type="dxa" w:w="1215"/>
+          </w:tcPr>
+          <w:p>
+            <w:r>
+              <w:t>{avg1_du_rsrp}</w:t>
+            </w:r>
+          </w:p>
+        </w:tc>
+        <w:tc>
+          <w:tcPr>
+            <w:tcW w:type="dxa" w:w="1215"/>
+          </w:tcPr>
+          <w:p>
+            <w:r>
+              <w:t>{avg1_du_rsrq}</w:t>
+            </w:r>
+          </w:p>
+        </w:tc>
+        <w:tc>
+          <w:tcPr>
+            <w:tcW w:type="dxa" w:w="1215"/>
+          </w:tcPr>
+          <w:p>
+            <w:r>
+              <w:t>{avg1_du_sinr}</w:t>
+            </w:r>
+          </w:p>
+        </w:tc>
+        <w:tc>
+          <w:tcPr>
+            <w:tcW w:type="dxa" w:w="1215"/>
+          </w:tcPr>
+          <w:p>
+            <w:r>
+              <w:t>{avg1_du_dl}</w:t>
+            </w:r>
+          </w:p>
+        </w:tc>
+        <w:tc>
+          <w:tcPr>
+            <w:tcW w:type="dxa" w:w="1215"/>
+          </w:tcPr>
+          <w:p>
+            <w:r>
+              <w:t>{avg1_du_ul}</w:t>
+            </w:r>
+          </w:p>
+        </w:tc>
+        <w:tc>
+          <w:tcPr>
+            <w:tcW w:type="dxa" w:w="1215"/>
+          </w:tcPr>
+          <w:p>
+            <w:r>
+              <w:t>{avg1_du_ping}</w:t>
+            </w:r>
+          </w:p>
+        </w:tc>
+        <w:tc>
+          <w:tcPr>
+            <w:tcW w:type="dxa" w:w="1215"/>
+          </w:tcPr>
+          <w:p>
+            <w:r>
+              <w:t>{avg1_du_jit}</w:t>
+            </w:r>
+          </w:p>
+        </w:tc>
+        <w:tc>
+          <w:tcPr>
+            <w:tcW w:type="dxa" w:w="1215"/>
+          </w:tcPr>
+          <w:p>
+            <w:r>
+              <w:t>{avg1_du_feas}</w:t>
+            </w:r>
+          </w:p>
+        </w:tc>
+      </w:tr>
+      <w:tr>
+        <w:tc>
+          <w:tcPr>
+            <w:tcW w:type="dxa" w:w="1215"/>
+          </w:tcPr>
+          <w:p>
+            <w:r>
+              <w:t>Carrier 2 - e&amp;</w:t>
+            </w:r>
+          </w:p>
+        </w:tc>
+        <w:tc>
+          <w:tcPr>
+            <w:tcW w:type="dxa" w:w="1215"/>
+          </w:tcPr>
+          <w:p>
+            <w:r>
+              <w:t>{avg1_et_rsrp}</w:t>
+            </w:r>
+          </w:p>
+        </w:tc>
+        <w:tc>
+          <w:tcPr>
+            <w:tcW w:type="dxa" w:w="1215"/>
+          </w:tcPr>
+          <w:p>
+            <w:r>
+              <w:t>{avg1_et_rsrq}</w:t>
+            </w:r>
+          </w:p>
+        </w:tc>
+        <w:tc>
+          <w:tcPr>
+            <w:tcW w:type="dxa" w:w="1215"/>
+          </w:tcPr>
+          <w:p>
+            <w:r>
+              <w:t>{avg1_et_sinr}</w:t>
+            </w:r>
+          </w:p>
+        </w:tc>
+        <w:tc>
+          <w:tcPr>
+            <w:tcW w:type="dxa" w:w="1215"/>
+          </w:tcPr>
+          <w:p>
+            <w:r>
+              <w:t>{avg1_et_dl}</w:t>
+            </w:r>
+          </w:p>
+        </w:tc>
+        <w:tc>
+          <w:tcPr>
+            <w:tcW w:type="dxa" w:w="1215"/>
+          </w:tcPr>
+          <w:p>
+            <w:r>
+              <w:t>{avg1_et_ul}</w:t>
+            </w:r>
+          </w:p>
+        </w:tc>
+        <w:tc>
+          <w:tcPr>
+            <w:tcW w:type="dxa" w:w="1215"/>
+          </w:tcPr>
+          <w:p>
+            <w:r>
+              <w:t>{avg1_et_ping}</w:t>
+            </w:r>
+          </w:p>
+        </w:tc>
+        <w:tc>
+          <w:tcPr>
+            <w:tcW w:type="dxa" w:w="1215"/>
+          </w:tcPr>
+          <w:p>
+            <w:r>
+              <w:t>{avg1_et_jit}</w:t>
+            </w:r>
+          </w:p>
+        </w:tc>
+        <w:tc>
+          <w:tcPr>
+            <w:tcW w:type="dxa" w:w="1215"/>
+          </w:tcPr>
+          <w:p>
+            <w:r>
+              <w:t>{avg1_et_feas}</w:t>
+            </w:r>
+          </w:p>
+        </w:tc>
+      </w:tr>
+    </w:tbl>
+    <w:p/>
     <w:p>
       <w:pPr>
         <w:pStyle w:val="TableParagraph"/>
@@ -14825,6 +15146,327 @@
         </w:tc>
       </w:tr>
     </w:tbl>
+    <w:tbl>
+      <w:tblPr>
+        <w:tblW w:type="auto" w:w="0"/>
+        <w:tblLook w:firstColumn="1" w:firstRow="1" w:lastColumn="0" w:lastRow="0" w:noHBand="0" w:noVBand="1" w:val="04A0"/>
+      </w:tblPr>
+      <w:tblGrid>
+        <w:gridCol w:w="1215"/>
+        <w:gridCol w:w="1215"/>
+        <w:gridCol w:w="1215"/>
+        <w:gridCol w:w="1215"/>
+        <w:gridCol w:w="1215"/>
+        <w:gridCol w:w="1215"/>
+        <w:gridCol w:w="1215"/>
+        <w:gridCol w:w="1215"/>
+        <w:gridCol w:w="1215"/>
+      </w:tblGrid>
+      <w:tr>
+        <w:tc>
+          <w:tcPr>
+            <w:tcW w:type="dxa" w:w="1215"/>
+          </w:tcPr>
+          <w:p>
+            <w:r>
+              <w:rPr>
+                <w:b/>
+              </w:rPr>
+              <w:t>Operator</w:t>
+            </w:r>
+          </w:p>
+        </w:tc>
+        <w:tc>
+          <w:tcPr>
+            <w:tcW w:type="dxa" w:w="1215"/>
+          </w:tcPr>
+          <w:p>
+            <w:r>
+              <w:rPr>
+                <w:b/>
+              </w:rPr>
+              <w:t>Avg RSRP (dBm)</w:t>
+            </w:r>
+          </w:p>
+        </w:tc>
+        <w:tc>
+          <w:tcPr>
+            <w:tcW w:type="dxa" w:w="1215"/>
+          </w:tcPr>
+          <w:p>
+            <w:r>
+              <w:rPr>
+                <w:b/>
+              </w:rPr>
+              <w:t>Avg RSRQ (dB)</w:t>
+            </w:r>
+          </w:p>
+        </w:tc>
+        <w:tc>
+          <w:tcPr>
+            <w:tcW w:type="dxa" w:w="1215"/>
+          </w:tcPr>
+          <w:p>
+            <w:r>
+              <w:rPr>
+                <w:b/>
+              </w:rPr>
+              <w:t>Avg SINR (dB)</w:t>
+            </w:r>
+          </w:p>
+        </w:tc>
+        <w:tc>
+          <w:tcPr>
+            <w:tcW w:type="dxa" w:w="1215"/>
+          </w:tcPr>
+          <w:p>
+            <w:r>
+              <w:rPr>
+                <w:b/>
+              </w:rPr>
+              <w:t>Avg DL (Mbps)</w:t>
+            </w:r>
+          </w:p>
+        </w:tc>
+        <w:tc>
+          <w:tcPr>
+            <w:tcW w:type="dxa" w:w="1215"/>
+          </w:tcPr>
+          <w:p>
+            <w:r>
+              <w:rPr>
+                <w:b/>
+              </w:rPr>
+              <w:t>Avg UL (Mbps)</w:t>
+            </w:r>
+          </w:p>
+        </w:tc>
+        <w:tc>
+          <w:tcPr>
+            <w:tcW w:type="dxa" w:w="1215"/>
+          </w:tcPr>
+          <w:p>
+            <w:r>
+              <w:rPr>
+                <w:b/>
+              </w:rPr>
+              <w:t>Avg Ping (ms)</w:t>
+            </w:r>
+          </w:p>
+        </w:tc>
+        <w:tc>
+          <w:tcPr>
+            <w:tcW w:type="dxa" w:w="1215"/>
+          </w:tcPr>
+          <w:p>
+            <w:r>
+              <w:rPr>
+                <w:b/>
+              </w:rPr>
+              <w:t>Avg Jitter (ms)</w:t>
+            </w:r>
+          </w:p>
+        </w:tc>
+        <w:tc>
+          <w:tcPr>
+            <w:tcW w:type="dxa" w:w="1215"/>
+          </w:tcPr>
+          <w:p>
+            <w:r>
+              <w:rPr>
+                <w:b/>
+              </w:rPr>
+              <w:t>Feasibility</w:t>
+            </w:r>
+          </w:p>
+        </w:tc>
+      </w:tr>
+      <w:tr>
+        <w:tc>
+          <w:tcPr>
+            <w:tcW w:type="dxa" w:w="1215"/>
+          </w:tcPr>
+          <w:p>
+            <w:r>
+              <w:t>Carrier 1 - du</w:t>
+            </w:r>
+          </w:p>
+        </w:tc>
+        <w:tc>
+          <w:tcPr>
+            <w:tcW w:type="dxa" w:w="1215"/>
+          </w:tcPr>
+          <w:p>
+            <w:r>
+              <w:t>{avg2_du_rsrp}</w:t>
+            </w:r>
+          </w:p>
+        </w:tc>
+        <w:tc>
+          <w:tcPr>
+            <w:tcW w:type="dxa" w:w="1215"/>
+          </w:tcPr>
+          <w:p>
+            <w:r>
+              <w:t>{avg2_du_rsrq}</w:t>
+            </w:r>
+          </w:p>
+        </w:tc>
+        <w:tc>
+          <w:tcPr>
+            <w:tcW w:type="dxa" w:w="1215"/>
+          </w:tcPr>
+          <w:p>
+            <w:r>
+              <w:t>{avg2_du_sinr}</w:t>
+            </w:r>
+          </w:p>
+        </w:tc>
+        <w:tc>
+          <w:tcPr>
+            <w:tcW w:type="dxa" w:w="1215"/>
+          </w:tcPr>
+          <w:p>
+            <w:r>
+              <w:t>{avg2_du_dl}</w:t>
+            </w:r>
+          </w:p>
+        </w:tc>
+        <w:tc>
+          <w:tcPr>
+            <w:tcW w:type="dxa" w:w="1215"/>
+          </w:tcPr>
+          <w:p>
+            <w:r>
+              <w:t>{avg2_du_ul}</w:t>
+            </w:r>
+          </w:p>
+        </w:tc>
+        <w:tc>
+          <w:tcPr>
+            <w:tcW w:type="dxa" w:w="1215"/>
+          </w:tcPr>
+          <w:p>
+            <w:r>
+              <w:t>{avg2_du_ping}</w:t>
+            </w:r>
+          </w:p>
+        </w:tc>
+        <w:tc>
+          <w:tcPr>
+            <w:tcW w:type="dxa" w:w="1215"/>
+          </w:tcPr>
+          <w:p>
+            <w:r>
+              <w:t>{avg2_du_jit}</w:t>
+            </w:r>
+          </w:p>
+        </w:tc>
+        <w:tc>
+          <w:tcPr>
+            <w:tcW w:type="dxa" w:w="1215"/>
+          </w:tcPr>
+          <w:p>
+            <w:r>
+              <w:t>{avg2_du_feas}</w:t>
+            </w:r>
+          </w:p>
+        </w:tc>
+      </w:tr>
+      <w:tr>
+        <w:tc>
+          <w:tcPr>
+            <w:tcW w:type="dxa" w:w="1215"/>
+          </w:tcPr>
+          <w:p>
+            <w:r>
+              <w:t>Carrier 2 - e&amp;</w:t>
+            </w:r>
+          </w:p>
+        </w:tc>
+        <w:tc>
+          <w:tcPr>
+            <w:tcW w:type="dxa" w:w="1215"/>
+          </w:tcPr>
+          <w:p>
+            <w:r>
+              <w:t>{avg2_et_rsrp}</w:t>
+            </w:r>
+          </w:p>
+        </w:tc>
+        <w:tc>
+          <w:tcPr>
+            <w:tcW w:type="dxa" w:w="1215"/>
+          </w:tcPr>
+          <w:p>
+            <w:r>
+              <w:t>{avg2_et_rsrq}</w:t>
+            </w:r>
+          </w:p>
+        </w:tc>
+        <w:tc>
+          <w:tcPr>
+            <w:tcW w:type="dxa" w:w="1215"/>
+          </w:tcPr>
+          <w:p>
+            <w:r>
+              <w:t>{avg2_et_sinr}</w:t>
+            </w:r>
+          </w:p>
+        </w:tc>
+        <w:tc>
+          <w:tcPr>
+            <w:tcW w:type="dxa" w:w="1215"/>
+          </w:tcPr>
+          <w:p>
+            <w:r>
+              <w:t>{avg2_et_dl}</w:t>
+            </w:r>
+          </w:p>
+        </w:tc>
+        <w:tc>
+          <w:tcPr>
+            <w:tcW w:type="dxa" w:w="1215"/>
+          </w:tcPr>
+          <w:p>
+            <w:r>
+              <w:t>{avg2_et_ul}</w:t>
+            </w:r>
+          </w:p>
+        </w:tc>
+        <w:tc>
+          <w:tcPr>
+            <w:tcW w:type="dxa" w:w="1215"/>
+          </w:tcPr>
+          <w:p>
+            <w:r>
+              <w:t>{avg2_et_ping}</w:t>
+            </w:r>
+          </w:p>
+        </w:tc>
+        <w:tc>
+          <w:tcPr>
+            <w:tcW w:type="dxa" w:w="1215"/>
+          </w:tcPr>
+          <w:p>
+            <w:r>
+              <w:t>{avg2_et_jit}</w:t>
+            </w:r>
+          </w:p>
+        </w:tc>
+        <w:tc>
+          <w:tcPr>
+            <w:tcW w:type="dxa" w:w="1215"/>
+          </w:tcPr>
+          <w:p>
+            <w:r>
+              <w:t>{avg2_et_feas}</w:t>
+            </w:r>
+          </w:p>
+        </w:tc>
+      </w:tr>
+    </w:tbl>
+    <w:p/>
     <w:p>
       <w:pPr>
         <w:rPr>

</xml_diff>

<commit_message>
One summary averages table after 3.3 (all RF measurements), with recommended-operator line
Co-Authored-By: Claude Sonnet 5 <noreply@anthropic.com>
Claude-Session: https://claude.ai/code/session_01FumjKuHqb2hcHBnB6rY5cR
</commit_message>
<xml_diff>
--- a/template.docx
+++ b/template.docx
@@ -10865,327 +10865,6 @@
         </w:tc>
       </w:tr>
     </w:tbl>
-    <w:tbl>
-      <w:tblPr>
-        <w:tblW w:type="auto" w:w="0"/>
-        <w:tblLook w:firstColumn="1" w:firstRow="1" w:lastColumn="0" w:lastRow="0" w:noHBand="0" w:noVBand="1" w:val="04A0"/>
-      </w:tblPr>
-      <w:tblGrid>
-        <w:gridCol w:w="1215"/>
-        <w:gridCol w:w="1215"/>
-        <w:gridCol w:w="1215"/>
-        <w:gridCol w:w="1215"/>
-        <w:gridCol w:w="1215"/>
-        <w:gridCol w:w="1215"/>
-        <w:gridCol w:w="1215"/>
-        <w:gridCol w:w="1215"/>
-        <w:gridCol w:w="1215"/>
-      </w:tblGrid>
-      <w:tr>
-        <w:tc>
-          <w:tcPr>
-            <w:tcW w:type="dxa" w:w="1215"/>
-          </w:tcPr>
-          <w:p>
-            <w:r>
-              <w:rPr>
-                <w:b/>
-              </w:rPr>
-              <w:t>Operator</w:t>
-            </w:r>
-          </w:p>
-        </w:tc>
-        <w:tc>
-          <w:tcPr>
-            <w:tcW w:type="dxa" w:w="1215"/>
-          </w:tcPr>
-          <w:p>
-            <w:r>
-              <w:rPr>
-                <w:b/>
-              </w:rPr>
-              <w:t>Avg RSRP (dBm)</w:t>
-            </w:r>
-          </w:p>
-        </w:tc>
-        <w:tc>
-          <w:tcPr>
-            <w:tcW w:type="dxa" w:w="1215"/>
-          </w:tcPr>
-          <w:p>
-            <w:r>
-              <w:rPr>
-                <w:b/>
-              </w:rPr>
-              <w:t>Avg RSRQ (dB)</w:t>
-            </w:r>
-          </w:p>
-        </w:tc>
-        <w:tc>
-          <w:tcPr>
-            <w:tcW w:type="dxa" w:w="1215"/>
-          </w:tcPr>
-          <w:p>
-            <w:r>
-              <w:rPr>
-                <w:b/>
-              </w:rPr>
-              <w:t>Avg SINR (dB)</w:t>
-            </w:r>
-          </w:p>
-        </w:tc>
-        <w:tc>
-          <w:tcPr>
-            <w:tcW w:type="dxa" w:w="1215"/>
-          </w:tcPr>
-          <w:p>
-            <w:r>
-              <w:rPr>
-                <w:b/>
-              </w:rPr>
-              <w:t>Avg DL (Mbps)</w:t>
-            </w:r>
-          </w:p>
-        </w:tc>
-        <w:tc>
-          <w:tcPr>
-            <w:tcW w:type="dxa" w:w="1215"/>
-          </w:tcPr>
-          <w:p>
-            <w:r>
-              <w:rPr>
-                <w:b/>
-              </w:rPr>
-              <w:t>Avg UL (Mbps)</w:t>
-            </w:r>
-          </w:p>
-        </w:tc>
-        <w:tc>
-          <w:tcPr>
-            <w:tcW w:type="dxa" w:w="1215"/>
-          </w:tcPr>
-          <w:p>
-            <w:r>
-              <w:rPr>
-                <w:b/>
-              </w:rPr>
-              <w:t>Avg Ping (ms)</w:t>
-            </w:r>
-          </w:p>
-        </w:tc>
-        <w:tc>
-          <w:tcPr>
-            <w:tcW w:type="dxa" w:w="1215"/>
-          </w:tcPr>
-          <w:p>
-            <w:r>
-              <w:rPr>
-                <w:b/>
-              </w:rPr>
-              <w:t>Avg Jitter (ms)</w:t>
-            </w:r>
-          </w:p>
-        </w:tc>
-        <w:tc>
-          <w:tcPr>
-            <w:tcW w:type="dxa" w:w="1215"/>
-          </w:tcPr>
-          <w:p>
-            <w:r>
-              <w:rPr>
-                <w:b/>
-              </w:rPr>
-              <w:t>Feasibility</w:t>
-            </w:r>
-          </w:p>
-        </w:tc>
-      </w:tr>
-      <w:tr>
-        <w:tc>
-          <w:tcPr>
-            <w:tcW w:type="dxa" w:w="1215"/>
-          </w:tcPr>
-          <w:p>
-            <w:r>
-              <w:t>Carrier 1 - du</w:t>
-            </w:r>
-          </w:p>
-        </w:tc>
-        <w:tc>
-          <w:tcPr>
-            <w:tcW w:type="dxa" w:w="1215"/>
-          </w:tcPr>
-          <w:p>
-            <w:r>
-              <w:t>{avg1_du_rsrp}</w:t>
-            </w:r>
-          </w:p>
-        </w:tc>
-        <w:tc>
-          <w:tcPr>
-            <w:tcW w:type="dxa" w:w="1215"/>
-          </w:tcPr>
-          <w:p>
-            <w:r>
-              <w:t>{avg1_du_rsrq}</w:t>
-            </w:r>
-          </w:p>
-        </w:tc>
-        <w:tc>
-          <w:tcPr>
-            <w:tcW w:type="dxa" w:w="1215"/>
-          </w:tcPr>
-          <w:p>
-            <w:r>
-              <w:t>{avg1_du_sinr}</w:t>
-            </w:r>
-          </w:p>
-        </w:tc>
-        <w:tc>
-          <w:tcPr>
-            <w:tcW w:type="dxa" w:w="1215"/>
-          </w:tcPr>
-          <w:p>
-            <w:r>
-              <w:t>{avg1_du_dl}</w:t>
-            </w:r>
-          </w:p>
-        </w:tc>
-        <w:tc>
-          <w:tcPr>
-            <w:tcW w:type="dxa" w:w="1215"/>
-          </w:tcPr>
-          <w:p>
-            <w:r>
-              <w:t>{avg1_du_ul}</w:t>
-            </w:r>
-          </w:p>
-        </w:tc>
-        <w:tc>
-          <w:tcPr>
-            <w:tcW w:type="dxa" w:w="1215"/>
-          </w:tcPr>
-          <w:p>
-            <w:r>
-              <w:t>{avg1_du_ping}</w:t>
-            </w:r>
-          </w:p>
-        </w:tc>
-        <w:tc>
-          <w:tcPr>
-            <w:tcW w:type="dxa" w:w="1215"/>
-          </w:tcPr>
-          <w:p>
-            <w:r>
-              <w:t>{avg1_du_jit}</w:t>
-            </w:r>
-          </w:p>
-        </w:tc>
-        <w:tc>
-          <w:tcPr>
-            <w:tcW w:type="dxa" w:w="1215"/>
-          </w:tcPr>
-          <w:p>
-            <w:r>
-              <w:t>{avg1_du_feas}</w:t>
-            </w:r>
-          </w:p>
-        </w:tc>
-      </w:tr>
-      <w:tr>
-        <w:tc>
-          <w:tcPr>
-            <w:tcW w:type="dxa" w:w="1215"/>
-          </w:tcPr>
-          <w:p>
-            <w:r>
-              <w:t>Carrier 2 - e&amp;</w:t>
-            </w:r>
-          </w:p>
-        </w:tc>
-        <w:tc>
-          <w:tcPr>
-            <w:tcW w:type="dxa" w:w="1215"/>
-          </w:tcPr>
-          <w:p>
-            <w:r>
-              <w:t>{avg1_et_rsrp}</w:t>
-            </w:r>
-          </w:p>
-        </w:tc>
-        <w:tc>
-          <w:tcPr>
-            <w:tcW w:type="dxa" w:w="1215"/>
-          </w:tcPr>
-          <w:p>
-            <w:r>
-              <w:t>{avg1_et_rsrq}</w:t>
-            </w:r>
-          </w:p>
-        </w:tc>
-        <w:tc>
-          <w:tcPr>
-            <w:tcW w:type="dxa" w:w="1215"/>
-          </w:tcPr>
-          <w:p>
-            <w:r>
-              <w:t>{avg1_et_sinr}</w:t>
-            </w:r>
-          </w:p>
-        </w:tc>
-        <w:tc>
-          <w:tcPr>
-            <w:tcW w:type="dxa" w:w="1215"/>
-          </w:tcPr>
-          <w:p>
-            <w:r>
-              <w:t>{avg1_et_dl}</w:t>
-            </w:r>
-          </w:p>
-        </w:tc>
-        <w:tc>
-          <w:tcPr>
-            <w:tcW w:type="dxa" w:w="1215"/>
-          </w:tcPr>
-          <w:p>
-            <w:r>
-              <w:t>{avg1_et_ul}</w:t>
-            </w:r>
-          </w:p>
-        </w:tc>
-        <w:tc>
-          <w:tcPr>
-            <w:tcW w:type="dxa" w:w="1215"/>
-          </w:tcPr>
-          <w:p>
-            <w:r>
-              <w:t>{avg1_et_ping}</w:t>
-            </w:r>
-          </w:p>
-        </w:tc>
-        <w:tc>
-          <w:tcPr>
-            <w:tcW w:type="dxa" w:w="1215"/>
-          </w:tcPr>
-          <w:p>
-            <w:r>
-              <w:t>{avg1_et_jit}</w:t>
-            </w:r>
-          </w:p>
-        </w:tc>
-        <w:tc>
-          <w:tcPr>
-            <w:tcW w:type="dxa" w:w="1215"/>
-          </w:tcPr>
-          <w:p>
-            <w:r>
-              <w:t>{avg1_et_feas}</w:t>
-            </w:r>
-          </w:p>
-        </w:tc>
-      </w:tr>
-    </w:tbl>
-    <w:p/>
     <w:p>
       <w:pPr>
         <w:pStyle w:val="TableParagraph"/>
@@ -15146,6 +14825,14 @@
         </w:tc>
       </w:tr>
     </w:tbl>
+    <w:p>
+      <w:r>
+        <w:rPr>
+          <w:b/>
+        </w:rPr>
+        <w:t>Summary — average across all RF measurements</w:t>
+      </w:r>
+    </w:p>
     <w:tbl>
       <w:tblPr>
         <w:tblW w:type="auto" w:w="0"/>
@@ -15298,7 +14985,7 @@
           </w:tcPr>
           <w:p>
             <w:r>
-              <w:t>{avg2_du_rsrp}</w:t>
+              <w:t>{avg_du_rsrp}</w:t>
             </w:r>
           </w:p>
         </w:tc>
@@ -15308,7 +14995,7 @@
           </w:tcPr>
           <w:p>
             <w:r>
-              <w:t>{avg2_du_rsrq}</w:t>
+              <w:t>{avg_du_rsrq}</w:t>
             </w:r>
           </w:p>
         </w:tc>
@@ -15318,7 +15005,7 @@
           </w:tcPr>
           <w:p>
             <w:r>
-              <w:t>{avg2_du_sinr}</w:t>
+              <w:t>{avg_du_sinr}</w:t>
             </w:r>
           </w:p>
         </w:tc>
@@ -15328,7 +15015,7 @@
           </w:tcPr>
           <w:p>
             <w:r>
-              <w:t>{avg2_du_dl}</w:t>
+              <w:t>{avg_du_dl}</w:t>
             </w:r>
           </w:p>
         </w:tc>
@@ -15338,7 +15025,7 @@
           </w:tcPr>
           <w:p>
             <w:r>
-              <w:t>{avg2_du_ul}</w:t>
+              <w:t>{avg_du_ul}</w:t>
             </w:r>
           </w:p>
         </w:tc>
@@ -15348,7 +15035,7 @@
           </w:tcPr>
           <w:p>
             <w:r>
-              <w:t>{avg2_du_ping}</w:t>
+              <w:t>{avg_du_ping}</w:t>
             </w:r>
           </w:p>
         </w:tc>
@@ -15358,7 +15045,7 @@
           </w:tcPr>
           <w:p>
             <w:r>
-              <w:t>{avg2_du_jit}</w:t>
+              <w:t>{avg_du_jit}</w:t>
             </w:r>
           </w:p>
         </w:tc>
@@ -15368,7 +15055,7 @@
           </w:tcPr>
           <w:p>
             <w:r>
-              <w:t>{avg2_du_feas}</w:t>
+              <w:t>{avg_du_feas}</w:t>
             </w:r>
           </w:p>
         </w:tc>
@@ -15390,7 +15077,7 @@
           </w:tcPr>
           <w:p>
             <w:r>
-              <w:t>{avg2_et_rsrp}</w:t>
+              <w:t>{avg_et_rsrp}</w:t>
             </w:r>
           </w:p>
         </w:tc>
@@ -15400,7 +15087,7 @@
           </w:tcPr>
           <w:p>
             <w:r>
-              <w:t>{avg2_et_rsrq}</w:t>
+              <w:t>{avg_et_rsrq}</w:t>
             </w:r>
           </w:p>
         </w:tc>
@@ -15410,7 +15097,7 @@
           </w:tcPr>
           <w:p>
             <w:r>
-              <w:t>{avg2_et_sinr}</w:t>
+              <w:t>{avg_et_sinr}</w:t>
             </w:r>
           </w:p>
         </w:tc>
@@ -15420,7 +15107,7 @@
           </w:tcPr>
           <w:p>
             <w:r>
-              <w:t>{avg2_et_dl}</w:t>
+              <w:t>{avg_et_dl}</w:t>
             </w:r>
           </w:p>
         </w:tc>
@@ -15430,7 +15117,7 @@
           </w:tcPr>
           <w:p>
             <w:r>
-              <w:t>{avg2_et_ul}</w:t>
+              <w:t>{avg_et_ul}</w:t>
             </w:r>
           </w:p>
         </w:tc>
@@ -15440,7 +15127,7 @@
           </w:tcPr>
           <w:p>
             <w:r>
-              <w:t>{avg2_et_ping}</w:t>
+              <w:t>{avg_et_ping}</w:t>
             </w:r>
           </w:p>
         </w:tc>
@@ -15450,7 +15137,7 @@
           </w:tcPr>
           <w:p>
             <w:r>
-              <w:t>{avg2_et_jit}</w:t>
+              <w:t>{avg_et_jit}</w:t>
             </w:r>
           </w:p>
         </w:tc>
@@ -15460,13 +15147,17 @@
           </w:tcPr>
           <w:p>
             <w:r>
-              <w:t>{avg2_et_feas}</w:t>
+              <w:t>{avg_et_feas}</w:t>
             </w:r>
           </w:p>
         </w:tc>
       </w:tr>
     </w:tbl>
-    <w:p/>
+    <w:p>
+      <w:r>
+        <w:t xml:space="preserve">Recommended operator: {avg_better} (stronger average signal / feasibility)</w:t>
+      </w:r>
+    </w:p>
     <w:p>
       <w:pPr>
         <w:rPr>

</xml_diff>

<commit_message>
Fix leftover Wall labels + stray Page-count text above the railing table (anchor removal on T4, not text match)
Co-Authored-By: Claude Sonnet 5 <noreply@anthropic.com>
Claude-Session: https://claude.ai/code/session_01FumjKuHqb2hcHBnB6rY5cR
</commit_message>
<xml_diff>
--- a/template.docx
+++ b/template.docx
@@ -4124,1212 +4124,6 @@
         </w:tc>
       </w:tr>
     </w:tbl>
-    <w:p>
-      <w:pPr>
-        <w:spacing w:before="29"/>
-        <w:rPr>
-          <w:b/>
-          <w:sz w:val="19"/>
-        </w:rPr>
-      </w:pPr>
-    </w:p>
-    <w:p>
-      <w:pPr>
-        <w:ind w:left="3123" w:right="2986"/>
-        <w:jc w:val="center"/>
-        <w:rPr>
-          <w:sz w:val="13"/>
-        </w:rPr>
-      </w:pPr>
-      <w:r>
-        <w:rPr>
-          <w:color w:val="6B7180"/>
-          <w:w w:val="125"/>
-          <w:sz w:val="13"/>
-        </w:rPr>
-        <w:t>Page</w:t>
-      </w:r>
-      <w:r>
-        <w:rPr>
-          <w:color w:val="6B7180"/>
-          <w:spacing w:val="10"/>
-          <w:w w:val="125"/>
-          <w:sz w:val="13"/>
-        </w:rPr>
-        <w:t xml:space="preserve"> </w:t>
-      </w:r>
-      <w:r>
-        <w:rPr>
-          <w:color w:val="6B7180"/>
-          <w:w w:val="125"/>
-          <w:sz w:val="13"/>
-        </w:rPr>
-        <w:t>1</w:t>
-      </w:r>
-      <w:r>
-        <w:rPr>
-          <w:color w:val="6B7180"/>
-          <w:spacing w:val="5"/>
-          <w:w w:val="125"/>
-          <w:sz w:val="13"/>
-        </w:rPr>
-        <w:t xml:space="preserve"> </w:t>
-      </w:r>
-      <w:r>
-        <w:rPr>
-          <w:color w:val="6B7180"/>
-          <w:w w:val="125"/>
-          <w:sz w:val="13"/>
-        </w:rPr>
-        <w:t>of</w:t>
-      </w:r>
-      <w:r>
-        <w:rPr>
-          <w:color w:val="6B7180"/>
-          <w:spacing w:val="-11"/>
-          <w:w w:val="125"/>
-          <w:sz w:val="13"/>
-        </w:rPr>
-        <w:t xml:space="preserve"> </w:t>
-      </w:r>
-      <w:r>
-        <w:rPr>
-          <w:color w:val="6B7180"/>
-          <w:spacing w:val="-10"/>
-          <w:w w:val="125"/>
-          <w:sz w:val="13"/>
-        </w:rPr>
-        <w:t>6</w:t>
-      </w:r>
-    </w:p>
-    <w:p>
-      <w:pPr>
-        <w:jc w:val="center"/>
-        <w:rPr>
-          <w:sz w:val="13"/>
-        </w:rPr>
-        <w:sectPr>
-          <w:type w:val="continuous"/>
-          <w:pgSz w:w="11930" w:h="16850"/>
-          <w:pgMar w:top="380" w:right="566" w:bottom="280" w:left="425" w:header="720" w:footer="720" w:gutter="0"/>
-          <w:cols w:space="720"/>
-        </w:sectPr>
-      </w:pPr>
-    </w:p>
-    <w:p>
-      <w:pPr>
-        <w:pStyle w:val="Heading3"/>
-        <w:spacing w:before="85"/>
-        <w:ind w:right="2852"/>
-      </w:pPr>
-      <w:r>
-        <w:rPr>
-          <w:noProof/>
-        </w:rPr>
-        <w:lastRenderedPageBreak/>
-        <mc:AlternateContent>
-          <mc:Choice Requires="wpg">
-            <w:drawing>
-              <wp:anchor distT="0" distB="0" distL="0" distR="0" simplePos="0" relativeHeight="486007296" behindDoc="1" locked="0" layoutInCell="1" allowOverlap="1" wp14:anchorId="257930B3" wp14:editId="354E080A">
-                <wp:simplePos x="0" y="0"/>
-                <wp:positionH relativeFrom="page">
-                  <wp:posOffset>356615</wp:posOffset>
-                </wp:positionH>
-                <wp:positionV relativeFrom="page">
-                  <wp:posOffset>167639</wp:posOffset>
-                </wp:positionV>
-                <wp:extent cx="7098665" cy="6567805"/>
-                <wp:effectExtent l="0" t="0" r="0" b="0"/>
-                <wp:wrapNone/>
-                <wp:docPr id="13" name="Group 13"/>
-                <wp:cNvGraphicFramePr>
-                  <a:graphicFrameLocks xmlns:a="http://schemas.openxmlformats.org/drawingml/2006/main"/>
-                </wp:cNvGraphicFramePr>
-                <a:graphic xmlns:a="http://schemas.openxmlformats.org/drawingml/2006/main">
-                  <a:graphicData uri="http://schemas.microsoft.com/office/word/2010/wordprocessingGroup">
-                    <wpg:wgp>
-                      <wpg:cNvGrpSpPr>
-                        <a:grpSpLocks/>
-                      </wpg:cNvGrpSpPr>
-                      <wpg:grpSpPr>
-                        <a:xfrm>
-                          <a:off x="0" y="0"/>
-                          <a:ext cx="7098665" cy="6567805"/>
-                          <a:chOff x="0" y="0"/>
-                          <a:chExt cx="7098665" cy="6567805"/>
-                        </a:xfrm>
-                      </wpg:grpSpPr>
-                      <wps:wsp>
-                        <wps:cNvPr id="14" name="Graphic 14"/>
-                        <wps:cNvSpPr/>
-                        <wps:spPr>
-                          <a:xfrm>
-                            <a:off x="2844419" y="643255"/>
-                            <a:ext cx="3070860" cy="2274570"/>
-                          </a:xfrm>
-                          <a:custGeom>
-                            <a:avLst/>
-                            <a:gdLst/>
-                            <a:ahLst/>
-                            <a:cxnLst/>
-                            <a:rect l="l" t="t" r="r" b="b"/>
-                            <a:pathLst>
-                              <a:path w="3070860" h="2274570">
-                                <a:moveTo>
-                                  <a:pt x="0" y="114300"/>
-                                </a:moveTo>
-                                <a:lnTo>
-                                  <a:pt x="3070860" y="114300"/>
-                                </a:lnTo>
-                                <a:lnTo>
-                                  <a:pt x="3070860" y="0"/>
-                                </a:lnTo>
-                                <a:lnTo>
-                                  <a:pt x="0" y="0"/>
-                                </a:lnTo>
-                                <a:lnTo>
-                                  <a:pt x="0" y="114300"/>
-                                </a:lnTo>
-                                <a:close/>
-                              </a:path>
-                              <a:path w="3070860" h="2274570">
-                                <a:moveTo>
-                                  <a:pt x="0" y="2274570"/>
-                                </a:moveTo>
-                                <a:lnTo>
-                                  <a:pt x="113664" y="2274570"/>
-                                </a:lnTo>
-                                <a:lnTo>
-                                  <a:pt x="113664" y="114300"/>
-                                </a:lnTo>
-                                <a:lnTo>
-                                  <a:pt x="0" y="114300"/>
-                                </a:lnTo>
-                                <a:lnTo>
-                                  <a:pt x="0" y="2274570"/>
-                                </a:lnTo>
-                                <a:close/>
-                              </a:path>
-                              <a:path w="3070860" h="2274570">
-                                <a:moveTo>
-                                  <a:pt x="2956560" y="2274570"/>
-                                </a:moveTo>
-                                <a:lnTo>
-                                  <a:pt x="3070860" y="2274570"/>
-                                </a:lnTo>
-                                <a:lnTo>
-                                  <a:pt x="3070860" y="114300"/>
-                                </a:lnTo>
-                                <a:lnTo>
-                                  <a:pt x="2956560" y="114300"/>
-                                </a:lnTo>
-                                <a:lnTo>
-                                  <a:pt x="2956560" y="2274570"/>
-                                </a:lnTo>
-                                <a:close/>
-                              </a:path>
-                              <a:path w="3070860" h="2274570">
-                                <a:moveTo>
-                                  <a:pt x="113664" y="1137285"/>
-                                </a:moveTo>
-                                <a:lnTo>
-                                  <a:pt x="2956560" y="1137285"/>
-                                </a:lnTo>
-                                <a:lnTo>
-                                  <a:pt x="2956560" y="1023620"/>
-                                </a:lnTo>
-                                <a:lnTo>
-                                  <a:pt x="113664" y="1023620"/>
-                                </a:lnTo>
-                                <a:lnTo>
-                                  <a:pt x="113664" y="1137285"/>
-                                </a:lnTo>
-                                <a:close/>
-                              </a:path>
-                            </a:pathLst>
-                          </a:custGeom>
-                          <a:ln w="11430">
-                            <a:solidFill>
-                              <a:srgbClr val="000000"/>
-                            </a:solidFill>
-                            <a:prstDash val="solid"/>
-                          </a:ln>
-                        </wps:spPr>
-                        <wps:bodyPr wrap="square" lIns="0" tIns="0" rIns="0" bIns="0" rtlCol="0">
-                          <a:prstTxWarp prst="textNoShape">
-                            <a:avLst/>
-                          </a:prstTxWarp>
-                          <a:noAutofit/>
-                        </wps:bodyPr>
-                      </wps:wsp>
-                      <wps:wsp>
-                        <wps:cNvPr id="15" name="Graphic 15"/>
-                        <wps:cNvSpPr/>
-                        <wps:spPr>
-                          <a:xfrm>
-                            <a:off x="2844419" y="370204"/>
-                            <a:ext cx="3070860" cy="2547620"/>
-                          </a:xfrm>
-                          <a:custGeom>
-                            <a:avLst/>
-                            <a:gdLst/>
-                            <a:ahLst/>
-                            <a:cxnLst/>
-                            <a:rect l="l" t="t" r="r" b="b"/>
-                            <a:pathLst>
-                              <a:path w="3070860" h="2547620">
-                                <a:moveTo>
-                                  <a:pt x="340994" y="1410335"/>
-                                </a:moveTo>
-                                <a:lnTo>
-                                  <a:pt x="340994" y="2547620"/>
-                                </a:lnTo>
-                              </a:path>
-                              <a:path w="3070860" h="2547620">
-                                <a:moveTo>
-                                  <a:pt x="295275" y="1410335"/>
-                                </a:moveTo>
-                                <a:lnTo>
-                                  <a:pt x="386714" y="1410335"/>
-                                </a:lnTo>
-                              </a:path>
-                              <a:path w="3070860" h="2547620">
-                                <a:moveTo>
-                                  <a:pt x="295275" y="2547620"/>
-                                </a:moveTo>
-                                <a:lnTo>
-                                  <a:pt x="386714" y="2547620"/>
-                                </a:lnTo>
-                              </a:path>
-                              <a:path w="3070860" h="2547620">
-                                <a:moveTo>
-                                  <a:pt x="340994" y="1296670"/>
-                                </a:moveTo>
-                                <a:lnTo>
-                                  <a:pt x="340994" y="387350"/>
-                                </a:lnTo>
-                              </a:path>
-                              <a:path w="3070860" h="2547620">
-                                <a:moveTo>
-                                  <a:pt x="386714" y="1296670"/>
-                                </a:moveTo>
-                                <a:lnTo>
-                                  <a:pt x="295275" y="1296670"/>
-                                </a:lnTo>
-                              </a:path>
-                              <a:path w="3070860" h="2547620">
-                                <a:moveTo>
-                                  <a:pt x="386714" y="387350"/>
-                                </a:moveTo>
-                                <a:lnTo>
-                                  <a:pt x="295275" y="387350"/>
-                                </a:lnTo>
-                              </a:path>
-                              <a:path w="3070860" h="2547620">
-                                <a:moveTo>
-                                  <a:pt x="0" y="45720"/>
-                                </a:moveTo>
-                                <a:lnTo>
-                                  <a:pt x="3070860" y="45720"/>
-                                </a:lnTo>
-                              </a:path>
-                              <a:path w="3070860" h="2547620">
-                                <a:moveTo>
-                                  <a:pt x="0" y="91440"/>
-                                </a:moveTo>
-                                <a:lnTo>
-                                  <a:pt x="0" y="0"/>
-                                </a:lnTo>
-                              </a:path>
-                              <a:path w="3070860" h="2547620">
-                                <a:moveTo>
-                                  <a:pt x="3070860" y="91440"/>
-                                </a:moveTo>
-                                <a:lnTo>
-                                  <a:pt x="3070860" y="0"/>
-                                </a:lnTo>
-                              </a:path>
-                            </a:pathLst>
-                          </a:custGeom>
-                          <a:ln w="9525">
-                            <a:solidFill>
-                              <a:srgbClr val="1563BE"/>
-                            </a:solidFill>
-                            <a:prstDash val="solid"/>
-                          </a:ln>
-                        </wps:spPr>
-                        <wps:bodyPr wrap="square" lIns="0" tIns="0" rIns="0" bIns="0" rtlCol="0">
-                          <a:prstTxWarp prst="textNoShape">
-                            <a:avLst/>
-                          </a:prstTxWarp>
-                          <a:noAutofit/>
-                        </wps:bodyPr>
-                      </wps:wsp>
-                      <wps:wsp>
-                        <wps:cNvPr id="16" name="Graphic 16"/>
-                        <wps:cNvSpPr/>
-                        <wps:spPr>
-                          <a:xfrm>
-                            <a:off x="7620" y="251459"/>
-                            <a:ext cx="1904364" cy="3149600"/>
-                          </a:xfrm>
-                          <a:custGeom>
-                            <a:avLst/>
-                            <a:gdLst/>
-                            <a:ahLst/>
-                            <a:cxnLst/>
-                            <a:rect l="l" t="t" r="r" b="b"/>
-                            <a:pathLst>
-                              <a:path w="1904364" h="3149600">
-                                <a:moveTo>
-                                  <a:pt x="1904111" y="0"/>
-                                </a:moveTo>
-                                <a:lnTo>
-                                  <a:pt x="0" y="0"/>
-                                </a:lnTo>
-                                <a:lnTo>
-                                  <a:pt x="0" y="3149219"/>
-                                </a:lnTo>
-                                <a:lnTo>
-                                  <a:pt x="1904111" y="3149219"/>
-                                </a:lnTo>
-                                <a:lnTo>
-                                  <a:pt x="1904111" y="0"/>
-                                </a:lnTo>
-                                <a:close/>
-                              </a:path>
-                            </a:pathLst>
-                          </a:custGeom>
-                          <a:solidFill>
-                            <a:srgbClr val="EEEEEE"/>
-                          </a:solidFill>
-                        </wps:spPr>
-                        <wps:bodyPr wrap="square" lIns="0" tIns="0" rIns="0" bIns="0" rtlCol="0">
-                          <a:prstTxWarp prst="textNoShape">
-                            <a:avLst/>
-                          </a:prstTxWarp>
-                          <a:noAutofit/>
-                        </wps:bodyPr>
-                      </wps:wsp>
-                      <wps:wsp>
-                        <wps:cNvPr id="17" name="Graphic 17"/>
-                        <wps:cNvSpPr/>
-                        <wps:spPr>
-                          <a:xfrm>
-                            <a:off x="0" y="242315"/>
-                            <a:ext cx="6841490" cy="3158490"/>
-                          </a:xfrm>
-                          <a:custGeom>
-                            <a:avLst/>
-                            <a:gdLst/>
-                            <a:ahLst/>
-                            <a:cxnLst/>
-                            <a:rect l="l" t="t" r="r" b="b"/>
-                            <a:pathLst>
-                              <a:path w="6841490" h="3158490">
-                                <a:moveTo>
-                                  <a:pt x="9131" y="0"/>
-                                </a:moveTo>
-                                <a:lnTo>
-                                  <a:pt x="0" y="0"/>
-                                </a:lnTo>
-                                <a:lnTo>
-                                  <a:pt x="0" y="9144"/>
-                                </a:lnTo>
-                                <a:lnTo>
-                                  <a:pt x="0" y="3158363"/>
-                                </a:lnTo>
-                                <a:lnTo>
-                                  <a:pt x="9131" y="3158363"/>
-                                </a:lnTo>
-                                <a:lnTo>
-                                  <a:pt x="9131" y="9144"/>
-                                </a:lnTo>
-                                <a:lnTo>
-                                  <a:pt x="9131" y="0"/>
-                                </a:lnTo>
-                                <a:close/>
-                              </a:path>
-                              <a:path w="6841490" h="3158490">
-                                <a:moveTo>
-                                  <a:pt x="1937004" y="0"/>
-                                </a:moveTo>
-                                <a:lnTo>
-                                  <a:pt x="1922399" y="0"/>
-                                </a:lnTo>
-                                <a:lnTo>
-                                  <a:pt x="1913255" y="0"/>
-                                </a:lnTo>
-                                <a:lnTo>
-                                  <a:pt x="9144" y="0"/>
-                                </a:lnTo>
-                                <a:lnTo>
-                                  <a:pt x="9144" y="9144"/>
-                                </a:lnTo>
-                                <a:lnTo>
-                                  <a:pt x="1913255" y="9144"/>
-                                </a:lnTo>
-                                <a:lnTo>
-                                  <a:pt x="1913255" y="3158363"/>
-                                </a:lnTo>
-                                <a:lnTo>
-                                  <a:pt x="1922399" y="3158363"/>
-                                </a:lnTo>
-                                <a:lnTo>
-                                  <a:pt x="1922399" y="9144"/>
-                                </a:lnTo>
-                                <a:lnTo>
-                                  <a:pt x="1937004" y="9144"/>
-                                </a:lnTo>
-                                <a:lnTo>
-                                  <a:pt x="1937004" y="0"/>
-                                </a:lnTo>
-                                <a:close/>
-                              </a:path>
-                              <a:path w="6841490" h="3158490">
-                                <a:moveTo>
-                                  <a:pt x="6841236" y="0"/>
-                                </a:moveTo>
-                                <a:lnTo>
-                                  <a:pt x="6832092" y="0"/>
-                                </a:lnTo>
-                                <a:lnTo>
-                                  <a:pt x="6777609" y="0"/>
-                                </a:lnTo>
-                                <a:lnTo>
-                                  <a:pt x="6777609" y="9144"/>
-                                </a:lnTo>
-                                <a:lnTo>
-                                  <a:pt x="6832092" y="9144"/>
-                                </a:lnTo>
-                                <a:lnTo>
-                                  <a:pt x="6832092" y="3158363"/>
-                                </a:lnTo>
-                                <a:lnTo>
-                                  <a:pt x="6841236" y="3158363"/>
-                                </a:lnTo>
-                                <a:lnTo>
-                                  <a:pt x="6841236" y="9144"/>
-                                </a:lnTo>
-                                <a:lnTo>
-                                  <a:pt x="6841236" y="0"/>
-                                </a:lnTo>
-                                <a:close/>
-                              </a:path>
-                            </a:pathLst>
-                          </a:custGeom>
-                          <a:solidFill>
-                            <a:srgbClr val="D1D3DB"/>
-                          </a:solidFill>
-                        </wps:spPr>
-                        <wps:bodyPr wrap="square" lIns="0" tIns="0" rIns="0" bIns="0" rtlCol="0">
-                          <a:prstTxWarp prst="textNoShape">
-                            <a:avLst/>
-                          </a:prstTxWarp>
-                          <a:noAutofit/>
-                        </wps:bodyPr>
-                      </wps:wsp>
-                      <wps:wsp>
-                        <wps:cNvPr id="18" name="Graphic 18"/>
-                        <wps:cNvSpPr/>
-                        <wps:spPr>
-                          <a:xfrm>
-                            <a:off x="7620" y="3409822"/>
-                            <a:ext cx="1904364" cy="3148965"/>
-                          </a:xfrm>
-                          <a:custGeom>
-                            <a:avLst/>
-                            <a:gdLst/>
-                            <a:ahLst/>
-                            <a:cxnLst/>
-                            <a:rect l="l" t="t" r="r" b="b"/>
-                            <a:pathLst>
-                              <a:path w="1904364" h="3148965">
-                                <a:moveTo>
-                                  <a:pt x="1904111" y="0"/>
-                                </a:moveTo>
-                                <a:lnTo>
-                                  <a:pt x="0" y="0"/>
-                                </a:lnTo>
-                                <a:lnTo>
-                                  <a:pt x="0" y="3148838"/>
-                                </a:lnTo>
-                                <a:lnTo>
-                                  <a:pt x="1904111" y="3148838"/>
-                                </a:lnTo>
-                                <a:lnTo>
-                                  <a:pt x="1904111" y="0"/>
-                                </a:lnTo>
-                                <a:close/>
-                              </a:path>
-                            </a:pathLst>
-                          </a:custGeom>
-                          <a:solidFill>
-                            <a:srgbClr val="EEEEEE"/>
-                          </a:solidFill>
-                        </wps:spPr>
-                        <wps:bodyPr wrap="square" lIns="0" tIns="0" rIns="0" bIns="0" rtlCol="0">
-                          <a:prstTxWarp prst="textNoShape">
-                            <a:avLst/>
-                          </a:prstTxWarp>
-                          <a:noAutofit/>
-                        </wps:bodyPr>
-                      </wps:wsp>
-                      <wps:wsp>
-                        <wps:cNvPr id="19" name="Graphic 19"/>
-                        <wps:cNvSpPr/>
-                        <wps:spPr>
-                          <a:xfrm>
-                            <a:off x="0" y="3400691"/>
-                            <a:ext cx="6841490" cy="3167380"/>
-                          </a:xfrm>
-                          <a:custGeom>
-                            <a:avLst/>
-                            <a:gdLst/>
-                            <a:ahLst/>
-                            <a:cxnLst/>
-                            <a:rect l="l" t="t" r="r" b="b"/>
-                            <a:pathLst>
-                              <a:path w="6841490" h="3167380">
-                                <a:moveTo>
-                                  <a:pt x="9131" y="3157982"/>
-                                </a:moveTo>
-                                <a:lnTo>
-                                  <a:pt x="0" y="3157982"/>
-                                </a:lnTo>
-                                <a:lnTo>
-                                  <a:pt x="0" y="3167113"/>
-                                </a:lnTo>
-                                <a:lnTo>
-                                  <a:pt x="9131" y="3167113"/>
-                                </a:lnTo>
-                                <a:lnTo>
-                                  <a:pt x="9131" y="3157982"/>
-                                </a:lnTo>
-                                <a:close/>
-                              </a:path>
-                              <a:path w="6841490" h="3167380">
-                                <a:moveTo>
-                                  <a:pt x="9131" y="0"/>
-                                </a:moveTo>
-                                <a:lnTo>
-                                  <a:pt x="0" y="0"/>
-                                </a:lnTo>
-                                <a:lnTo>
-                                  <a:pt x="0" y="9131"/>
-                                </a:lnTo>
-                                <a:lnTo>
-                                  <a:pt x="0" y="3157969"/>
-                                </a:lnTo>
-                                <a:lnTo>
-                                  <a:pt x="9131" y="3157969"/>
-                                </a:lnTo>
-                                <a:lnTo>
-                                  <a:pt x="9131" y="9131"/>
-                                </a:lnTo>
-                                <a:lnTo>
-                                  <a:pt x="9131" y="0"/>
-                                </a:lnTo>
-                                <a:close/>
-                              </a:path>
-                              <a:path w="6841490" h="3167380">
-                                <a:moveTo>
-                                  <a:pt x="6841236" y="3157982"/>
-                                </a:moveTo>
-                                <a:lnTo>
-                                  <a:pt x="6832092" y="3157982"/>
-                                </a:lnTo>
-                                <a:lnTo>
-                                  <a:pt x="1922399" y="3157982"/>
-                                </a:lnTo>
-                                <a:lnTo>
-                                  <a:pt x="1913255" y="3157982"/>
-                                </a:lnTo>
-                                <a:lnTo>
-                                  <a:pt x="9144" y="3157982"/>
-                                </a:lnTo>
-                                <a:lnTo>
-                                  <a:pt x="9144" y="3167113"/>
-                                </a:lnTo>
-                                <a:lnTo>
-                                  <a:pt x="1913255" y="3167113"/>
-                                </a:lnTo>
-                                <a:lnTo>
-                                  <a:pt x="1922399" y="3167113"/>
-                                </a:lnTo>
-                                <a:lnTo>
-                                  <a:pt x="6832092" y="3167113"/>
-                                </a:lnTo>
-                                <a:lnTo>
-                                  <a:pt x="6841236" y="3167113"/>
-                                </a:lnTo>
-                                <a:lnTo>
-                                  <a:pt x="6841236" y="3157982"/>
-                                </a:lnTo>
-                                <a:close/>
-                              </a:path>
-                              <a:path w="6841490" h="3167380">
-                                <a:moveTo>
-                                  <a:pt x="6841236" y="0"/>
-                                </a:moveTo>
-                                <a:lnTo>
-                                  <a:pt x="6832092" y="0"/>
-                                </a:lnTo>
-                                <a:lnTo>
-                                  <a:pt x="1922399" y="0"/>
-                                </a:lnTo>
-                                <a:lnTo>
-                                  <a:pt x="1913255" y="0"/>
-                                </a:lnTo>
-                                <a:lnTo>
-                                  <a:pt x="9144" y="0"/>
-                                </a:lnTo>
-                                <a:lnTo>
-                                  <a:pt x="9144" y="9131"/>
-                                </a:lnTo>
-                                <a:lnTo>
-                                  <a:pt x="1913255" y="9131"/>
-                                </a:lnTo>
-                                <a:lnTo>
-                                  <a:pt x="1913255" y="3157969"/>
-                                </a:lnTo>
-                                <a:lnTo>
-                                  <a:pt x="1922399" y="3157969"/>
-                                </a:lnTo>
-                                <a:lnTo>
-                                  <a:pt x="1922399" y="9131"/>
-                                </a:lnTo>
-                                <a:lnTo>
-                                  <a:pt x="6832092" y="9131"/>
-                                </a:lnTo>
-                                <a:lnTo>
-                                  <a:pt x="6832092" y="3157969"/>
-                                </a:lnTo>
-                                <a:lnTo>
-                                  <a:pt x="6841236" y="3157969"/>
-                                </a:lnTo>
-                                <a:lnTo>
-                                  <a:pt x="6841236" y="9131"/>
-                                </a:lnTo>
-                                <a:lnTo>
-                                  <a:pt x="6841236" y="0"/>
-                                </a:lnTo>
-                                <a:close/>
-                              </a:path>
-                            </a:pathLst>
-                          </a:custGeom>
-                          <a:solidFill>
-                            <a:srgbClr val="D1D3DB"/>
-                          </a:solidFill>
-                        </wps:spPr>
-                        <wps:bodyPr wrap="square" lIns="0" tIns="0" rIns="0" bIns="0" rtlCol="0">
-                          <a:prstTxWarp prst="textNoShape">
-                            <a:avLst/>
-                          </a:prstTxWarp>
-                          <a:noAutofit/>
-                        </wps:bodyPr>
-                      </wps:wsp>
-                      <pic:pic xmlns:pic="http://schemas.openxmlformats.org/drawingml/2006/picture">
-                        <pic:nvPicPr>
-                          <pic:cNvPr id="20" name="Image 20"/>
-                          <pic:cNvPicPr/>
-                        </pic:nvPicPr>
-                        <pic:blipFill>
-                          <a:blip r:embed="rId8" cstate="print"/>
-                          <a:stretch>
-                            <a:fillRect/>
-                          </a:stretch>
-                        </pic:blipFill>
-                        <pic:spPr>
-                          <a:xfrm>
-                            <a:off x="1912620" y="185978"/>
-                            <a:ext cx="4902708" cy="134061"/>
-                          </a:xfrm>
-                          <a:prstGeom prst="rect">
-                            <a:avLst/>
-                          </a:prstGeom>
-                        </pic:spPr>
-                      </pic:pic>
-                      <wps:wsp>
-                        <wps:cNvPr id="21" name="Graphic 21"/>
-                        <wps:cNvSpPr/>
-                        <wps:spPr>
-                          <a:xfrm>
-                            <a:off x="1956054" y="224154"/>
-                            <a:ext cx="4802505" cy="15240"/>
-                          </a:xfrm>
-                          <a:custGeom>
-                            <a:avLst/>
-                            <a:gdLst/>
-                            <a:ahLst/>
-                            <a:cxnLst/>
-                            <a:rect l="l" t="t" r="r" b="b"/>
-                            <a:pathLst>
-                              <a:path w="4802505" h="15240">
-                                <a:moveTo>
-                                  <a:pt x="0" y="15240"/>
-                                </a:moveTo>
-                                <a:lnTo>
-                                  <a:pt x="4802505" y="0"/>
-                                </a:lnTo>
-                              </a:path>
-                            </a:pathLst>
-                          </a:custGeom>
-                          <a:ln w="38100">
-                            <a:solidFill>
-                              <a:srgbClr val="000000"/>
-                            </a:solidFill>
-                            <a:prstDash val="solid"/>
-                          </a:ln>
-                        </wps:spPr>
-                        <wps:bodyPr wrap="square" lIns="0" tIns="0" rIns="0" bIns="0" rtlCol="0">
-                          <a:prstTxWarp prst="textNoShape">
-                            <a:avLst/>
-                          </a:prstTxWarp>
-                          <a:noAutofit/>
-                        </wps:bodyPr>
-                      </wps:wsp>
-                      <wps:wsp>
-                        <wps:cNvPr id="22" name="Graphic 22"/>
-                        <wps:cNvSpPr/>
-                        <wps:spPr>
-                          <a:xfrm>
-                            <a:off x="4700523" y="3175"/>
-                            <a:ext cx="561340" cy="231775"/>
-                          </a:xfrm>
-                          <a:custGeom>
-                            <a:avLst/>
-                            <a:gdLst/>
-                            <a:ahLst/>
-                            <a:cxnLst/>
-                            <a:rect l="l" t="t" r="r" b="b"/>
-                            <a:pathLst>
-                              <a:path w="561340" h="231775">
-                                <a:moveTo>
-                                  <a:pt x="561339" y="0"/>
-                                </a:moveTo>
-                                <a:lnTo>
-                                  <a:pt x="0" y="0"/>
-                                </a:lnTo>
-                                <a:lnTo>
-                                  <a:pt x="0" y="231775"/>
-                                </a:lnTo>
-                                <a:lnTo>
-                                  <a:pt x="561339" y="231775"/>
-                                </a:lnTo>
-                                <a:lnTo>
-                                  <a:pt x="561339" y="0"/>
-                                </a:lnTo>
-                                <a:close/>
-                              </a:path>
-                            </a:pathLst>
-                          </a:custGeom>
-                          <a:solidFill>
-                            <a:srgbClr val="FFFFFF"/>
-                          </a:solidFill>
-                        </wps:spPr>
-                        <wps:bodyPr wrap="square" lIns="0" tIns="0" rIns="0" bIns="0" rtlCol="0">
-                          <a:prstTxWarp prst="textNoShape">
-                            <a:avLst/>
-                          </a:prstTxWarp>
-                          <a:noAutofit/>
-                        </wps:bodyPr>
-                      </wps:wsp>
-                      <wps:wsp>
-                        <wps:cNvPr id="23" name="Graphic 23"/>
-                        <wps:cNvSpPr/>
-                        <wps:spPr>
-                          <a:xfrm>
-                            <a:off x="4700523" y="3175"/>
-                            <a:ext cx="561340" cy="231775"/>
-                          </a:xfrm>
-                          <a:custGeom>
-                            <a:avLst/>
-                            <a:gdLst/>
-                            <a:ahLst/>
-                            <a:cxnLst/>
-                            <a:rect l="l" t="t" r="r" b="b"/>
-                            <a:pathLst>
-                              <a:path w="561340" h="231775">
-                                <a:moveTo>
-                                  <a:pt x="0" y="231775"/>
-                                </a:moveTo>
-                                <a:lnTo>
-                                  <a:pt x="561339" y="231775"/>
-                                </a:lnTo>
-                                <a:lnTo>
-                                  <a:pt x="561339" y="0"/>
-                                </a:lnTo>
-                                <a:lnTo>
-                                  <a:pt x="0" y="0"/>
-                                </a:lnTo>
-                                <a:lnTo>
-                                  <a:pt x="0" y="231775"/>
-                                </a:lnTo>
-                                <a:close/>
-                              </a:path>
-                            </a:pathLst>
-                          </a:custGeom>
-                          <a:ln w="6350">
-                            <a:solidFill>
-                              <a:srgbClr val="000000"/>
-                            </a:solidFill>
-                            <a:prstDash val="solid"/>
-                          </a:ln>
-                        </wps:spPr>
-                        <wps:bodyPr wrap="square" lIns="0" tIns="0" rIns="0" bIns="0" rtlCol="0">
-                          <a:prstTxWarp prst="textNoShape">
-                            <a:avLst/>
-                          </a:prstTxWarp>
-                          <a:noAutofit/>
-                        </wps:bodyPr>
-                      </wps:wsp>
-                      <wps:wsp>
-                        <wps:cNvPr id="24" name="Graphic 24"/>
-                        <wps:cNvSpPr/>
-                        <wps:spPr>
-                          <a:xfrm>
-                            <a:off x="6863333" y="1213485"/>
-                            <a:ext cx="231775" cy="561340"/>
-                          </a:xfrm>
-                          <a:custGeom>
-                            <a:avLst/>
-                            <a:gdLst/>
-                            <a:ahLst/>
-                            <a:cxnLst/>
-                            <a:rect l="l" t="t" r="r" b="b"/>
-                            <a:pathLst>
-                              <a:path w="231775" h="561340">
-                                <a:moveTo>
-                                  <a:pt x="0" y="561340"/>
-                                </a:moveTo>
-                                <a:lnTo>
-                                  <a:pt x="231775" y="561340"/>
-                                </a:lnTo>
-                                <a:lnTo>
-                                  <a:pt x="231775" y="0"/>
-                                </a:lnTo>
-                                <a:lnTo>
-                                  <a:pt x="0" y="0"/>
-                                </a:lnTo>
-                                <a:lnTo>
-                                  <a:pt x="0" y="561340"/>
-                                </a:lnTo>
-                                <a:close/>
-                              </a:path>
-                            </a:pathLst>
-                          </a:custGeom>
-                          <a:ln w="6350">
-                            <a:solidFill>
-                              <a:srgbClr val="000000"/>
-                            </a:solidFill>
-                            <a:prstDash val="solid"/>
-                          </a:ln>
-                        </wps:spPr>
-                        <wps:bodyPr wrap="square" lIns="0" tIns="0" rIns="0" bIns="0" rtlCol="0">
-                          <a:prstTxWarp prst="textNoShape">
-                            <a:avLst/>
-                          </a:prstTxWarp>
-                          <a:noAutofit/>
-                        </wps:bodyPr>
-                      </wps:wsp>
-                      <pic:pic xmlns:pic="http://schemas.openxmlformats.org/drawingml/2006/picture">
-                        <pic:nvPicPr>
-                          <pic:cNvPr id="25" name="Image 25"/>
-                          <pic:cNvPicPr/>
-                        </pic:nvPicPr>
-                        <pic:blipFill>
-                          <a:blip r:embed="rId9" cstate="print"/>
-                          <a:stretch>
-                            <a:fillRect/>
-                          </a:stretch>
-                        </pic:blipFill>
-                        <pic:spPr>
-                          <a:xfrm>
-                            <a:off x="6688835" y="228600"/>
-                            <a:ext cx="129641" cy="2734055"/>
-                          </a:xfrm>
-                          <a:prstGeom prst="rect">
-                            <a:avLst/>
-                          </a:prstGeom>
-                        </pic:spPr>
-                      </pic:pic>
-                      <wps:wsp>
-                        <wps:cNvPr id="26" name="Graphic 26"/>
-                        <wps:cNvSpPr/>
-                        <wps:spPr>
-                          <a:xfrm>
-                            <a:off x="6750939" y="247650"/>
-                            <a:ext cx="10795" cy="2635250"/>
-                          </a:xfrm>
-                          <a:custGeom>
-                            <a:avLst/>
-                            <a:gdLst/>
-                            <a:ahLst/>
-                            <a:cxnLst/>
-                            <a:rect l="l" t="t" r="r" b="b"/>
-                            <a:pathLst>
-                              <a:path w="10795" h="2635250">
-                                <a:moveTo>
-                                  <a:pt x="0" y="0"/>
-                                </a:moveTo>
-                                <a:lnTo>
-                                  <a:pt x="10795" y="2635250"/>
-                                </a:lnTo>
-                              </a:path>
-                            </a:pathLst>
-                          </a:custGeom>
-                          <a:ln w="38099">
-                            <a:solidFill>
-                              <a:srgbClr val="000000"/>
-                            </a:solidFill>
-                            <a:prstDash val="solid"/>
-                          </a:ln>
-                        </wps:spPr>
-                        <wps:bodyPr wrap="square" lIns="0" tIns="0" rIns="0" bIns="0" rtlCol="0">
-                          <a:prstTxWarp prst="textNoShape">
-                            <a:avLst/>
-                          </a:prstTxWarp>
-                          <a:noAutofit/>
-                        </wps:bodyPr>
-                      </wps:wsp>
-                      <wps:wsp>
-                        <wps:cNvPr id="27" name="Graphic 27"/>
-                        <wps:cNvSpPr/>
-                        <wps:spPr>
-                          <a:xfrm>
-                            <a:off x="5797803" y="239395"/>
-                            <a:ext cx="963930" cy="791845"/>
-                          </a:xfrm>
-                          <a:custGeom>
-                            <a:avLst/>
-                            <a:gdLst/>
-                            <a:ahLst/>
-                            <a:cxnLst/>
-                            <a:rect l="l" t="t" r="r" b="b"/>
-                            <a:pathLst>
-                              <a:path w="963930" h="791845">
-                                <a:moveTo>
-                                  <a:pt x="123189" y="791464"/>
-                                </a:moveTo>
-                                <a:lnTo>
-                                  <a:pt x="963929" y="791464"/>
-                                </a:lnTo>
-                              </a:path>
-                              <a:path w="963930" h="791845">
-                                <a:moveTo>
-                                  <a:pt x="0" y="0"/>
-                                </a:moveTo>
-                                <a:lnTo>
-                                  <a:pt x="7619" y="376554"/>
-                                </a:lnTo>
-                              </a:path>
-                            </a:pathLst>
-                          </a:custGeom>
-                          <a:ln w="9525">
-                            <a:solidFill>
-                              <a:srgbClr val="497DBA"/>
-                            </a:solidFill>
-                            <a:prstDash val="solid"/>
-                          </a:ln>
-                        </wps:spPr>
-                        <wps:bodyPr wrap="square" lIns="0" tIns="0" rIns="0" bIns="0" rtlCol="0">
-                          <a:prstTxWarp prst="textNoShape">
-                            <a:avLst/>
-                          </a:prstTxWarp>
-                          <a:noAutofit/>
-                        </wps:bodyPr>
-                      </wps:wsp>
-                    </wpg:wgp>
-                  </a:graphicData>
-                </a:graphic>
-              </wp:anchor>
-            </w:drawing>
-          </mc:Choice>
-          <mc:Fallback>
-            <w:pict>
-              <v:group w14:anchorId="7E0E507D" id="Group 13" o:spid="_x0000_s1026" style="position:absolute;margin-left:28.1pt;margin-top:13.2pt;width:558.95pt;height:517.15pt;z-index:-17309184;mso-wrap-distance-left:0;mso-wrap-distance-right:0;mso-position-horizontal-relative:page;mso-position-vertical-relative:page" coordsize="70986,65678" o:gfxdata="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">
-                <v:shape id="Graphic 14" o:spid="_x0000_s1027" style="position:absolute;left:28444;top:6432;width:30708;height:22746;visibility:visible;mso-wrap-style:square;v-text-anchor:top" coordsize="3070860,2274570" o:gfxdata="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" path="m,114300r3070860,l3070860,,,,,114300xem,2274570r113664,l113664,114300,,114300,,2274570xem2956560,2274570r114300,l3070860,114300r-114300,l2956560,2274570xem113664,1137285r2842896,l2956560,1023620r-2842896,l113664,1137285xe" filled="f" strokeweight=".9pt">
-                  <v:path arrowok="t"/>
-                </v:shape>
-                <v:shape id="Graphic 15" o:spid="_x0000_s1028" style="position:absolute;left:28444;top:3702;width:30708;height:25476;visibility:visible;mso-wrap-style:square;v-text-anchor:top" coordsize="3070860,2547620" o:gfxdata="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" path="m340994,1410335r,1137285em295275,1410335r91439,em295275,2547620r91439,em340994,1296670r,-909320em386714,1296670r-91439,em386714,387350r-91439,em,45720r3070860,em,91440l,em3070860,91440r,-91440e" filled="f" strokecolor="#1563be">
-                  <v:path arrowok="t"/>
-                </v:shape>
-                <v:shape id="Graphic 16" o:spid="_x0000_s1029" style="position:absolute;left:76;top:2514;width:19043;height:31496;visibility:visible;mso-wrap-style:square;v-text-anchor:top" coordsize="1904364,3149600" o:gfxdata="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" path="m1904111,l,,,3149219r1904111,l1904111,xe" fillcolor="#eee" stroked="f">
-                  <v:path arrowok="t"/>
-                </v:shape>
-                <v:shape id="Graphic 17" o:spid="_x0000_s1030" style="position:absolute;top:2423;width:68414;height:31585;visibility:visible;mso-wrap-style:square;v-text-anchor:top" coordsize="6841490,3158490" o:gfxdata="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" path="m9131,l,,,9144,,3158363r9131,l9131,9144,9131,xem1937004,r-14605,l1913255,,9144,r,9144l1913255,9144r,3149219l1922399,3158363r,-3149219l1937004,9144r,-9144xem6841236,r-9144,l6777609,r,9144l6832092,9144r,3149219l6841236,3158363r,-3149219l6841236,xe" fillcolor="#d1d3db" stroked="f">
-                  <v:path arrowok="t"/>
-                </v:shape>
-                <v:shape id="Graphic 18" o:spid="_x0000_s1031" style="position:absolute;left:76;top:34098;width:19043;height:31489;visibility:visible;mso-wrap-style:square;v-text-anchor:top" coordsize="1904364,3148965" o:gfxdata="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" path="m1904111,l,,,3148838r1904111,l1904111,xe" fillcolor="#eee" stroked="f">
-                  <v:path arrowok="t"/>
-                </v:shape>
-                <v:shape id="Graphic 19" o:spid="_x0000_s1032" style="position:absolute;top:34006;width:68414;height:31674;visibility:visible;mso-wrap-style:square;v-text-anchor:top" coordsize="6841490,3167380" o:gfxdata="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" path="m9131,3157982r-9131,l,3167113r9131,l9131,3157982xem9131,l,,,9131,,3157969r9131,l9131,9131,9131,xem6841236,3157982r-9144,l1922399,3157982r-9144,l9144,3157982r,9131l1913255,3167113r9144,l6832092,3167113r9144,l6841236,3157982xem6841236,r-9144,l1922399,r-9144,l9144,r,9131l1913255,9131r,3148838l1922399,3157969r,-3148838l6832092,9131r,3148838l6841236,3157969r,-3148838l6841236,xe" fillcolor="#d1d3db" stroked="f">
-                  <v:path arrowok="t"/>
-                </v:shape>
-                <v:shapetype id="_x0000_t75" coordsize="21600,21600" o:spt="75" o:preferrelative="t" path="m@4@5l@4@11@9@11@9@5xe" filled="f" stroked="f">
-                  <v:stroke joinstyle="miter"/>
-                  <v:formulas>
-                    <v:f eqn="if lineDrawn pixelLineWidth 0"/>
-                    <v:f eqn="sum @0 1 0"/>
-                    <v:f eqn="sum 0 0 @1"/>
-                    <v:f eqn="prod @2 1 2"/>
-                    <v:f eqn="prod @3 21600 pixelWidth"/>
-                    <v:f eqn="prod @3 21600 pixelHeight"/>
-                    <v:f eqn="sum @0 0 1"/>
-                    <v:f eqn="prod @6 1 2"/>
-                    <v:f eqn="prod @7 21600 pixelWidth"/>
-                    <v:f eqn="sum @8 21600 0"/>
-                    <v:f eqn="prod @7 21600 pixelHeight"/>
-                    <v:f eqn="sum @10 21600 0"/>
-                  </v:formulas>
-                  <v:path o:extrusionok="f" gradientshapeok="t" o:connecttype="rect"/>
-                  <o:lock v:ext="edit" aspectratio="t"/>
-                </v:shapetype>
-                <v:shape id="Image 20" o:spid="_x0000_s1033" type="#_x0000_t75" style="position:absolute;left:19126;top:1859;width:49027;height:1341;visibility:visible;mso-wrap-style:square" o:gfxdata="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">
-                  <v:imagedata r:id="rId10" o:title=""/>
-                </v:shape>
-                <v:shape id="Graphic 21" o:spid="_x0000_s1034" style="position:absolute;left:19560;top:2241;width:48025;height:152;visibility:visible;mso-wrap-style:square;v-text-anchor:top" coordsize="4802505,15240" o:gfxdata="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" path="m,15240l4802505,e" filled="f" strokeweight="3pt">
-                  <v:path arrowok="t"/>
-                </v:shape>
-                <v:shape id="Graphic 22" o:spid="_x0000_s1035" style="position:absolute;left:47005;top:31;width:5613;height:2318;visibility:visible;mso-wrap-style:square;v-text-anchor:top" coordsize="561340,231775" o:gfxdata="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" path="m561339,l,,,231775r561339,l561339,xe" stroked="f">
-                  <v:path arrowok="t"/>
-                </v:shape>
-                <v:shape id="Graphic 23" o:spid="_x0000_s1036" style="position:absolute;left:47005;top:31;width:5613;height:2318;visibility:visible;mso-wrap-style:square;v-text-anchor:top" coordsize="561340,231775" o:gfxdata="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" path="m,231775r561339,l561339,,,,,231775xe" filled="f" strokeweight=".5pt">
-                  <v:path arrowok="t"/>
-                </v:shape>
-                <v:shape id="Graphic 24" o:spid="_x0000_s1037" style="position:absolute;left:68633;top:12134;width:2318;height:5614;visibility:visible;mso-wrap-style:square;v-text-anchor:top" coordsize="231775,561340" o:gfxdata="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" path="m,561340r231775,l231775,,,,,561340xe" filled="f" strokeweight=".5pt">
-                  <v:path arrowok="t"/>
-                </v:shape>
-                <v:shape id="Image 25" o:spid="_x0000_s1038" type="#_x0000_t75" style="position:absolute;left:66888;top:2286;width:1296;height:27340;visibility:visible;mso-wrap-style:square" o:gfxdata="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">
-                  <v:imagedata r:id="rId11" o:title=""/>
-                </v:shape>
-                <v:shape id="Graphic 26" o:spid="_x0000_s1039" style="position:absolute;left:67509;top:2476;width:108;height:26353;visibility:visible;mso-wrap-style:square;v-text-anchor:top" coordsize="10795,2635250" o:gfxdata="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" path="m,l10795,2635250e" filled="f" strokeweight="1.0583mm">
-                  <v:path arrowok="t"/>
-                </v:shape>
-                <v:shape id="Graphic 27" o:spid="_x0000_s1040" style="position:absolute;left:57978;top:2393;width:9639;height:7919;visibility:visible;mso-wrap-style:square;v-text-anchor:top" coordsize="963930,791845" o:gfxdata="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" path="m123189,791464r840740,em,l7619,376554e" filled="f" strokecolor="#497dba">
-                  <v:path arrowok="t"/>
-                </v:shape>
-                <w10:wrap anchorx="page" anchory="page"/>
-              </v:group>
-            </w:pict>
-          </mc:Fallback>
-        </mc:AlternateContent>
-      </w:r>
-      <w:r>
-        <w:rPr>
-          <w:noProof/>
-        </w:rPr>
-        <mc:AlternateContent>
-          <mc:Choice Requires="wps">
-            <w:drawing>
-              <wp:anchor distT="0" distB="0" distL="0" distR="0" simplePos="0" relativeHeight="15733760" behindDoc="0" locked="0" layoutInCell="1" allowOverlap="1" wp14:anchorId="0D972647" wp14:editId="7AA41F92">
-                <wp:simplePos x="0" y="0"/>
-                <wp:positionH relativeFrom="page">
-                  <wp:posOffset>7246436</wp:posOffset>
-                </wp:positionH>
-                <wp:positionV relativeFrom="page">
-                  <wp:posOffset>1462531</wp:posOffset>
-                </wp:positionV>
-                <wp:extent cx="165735" cy="271145"/>
-                <wp:effectExtent l="0" t="0" r="0" b="0"/>
-                <wp:wrapNone/>
-                <wp:docPr id="28" name="Textbox 28"/>
-                <wp:cNvGraphicFramePr>
-                  <a:graphicFrameLocks xmlns:a="http://schemas.openxmlformats.org/drawingml/2006/main"/>
-                </wp:cNvGraphicFramePr>
-                <a:graphic xmlns:a="http://schemas.openxmlformats.org/drawingml/2006/main">
-                  <a:graphicData uri="http://schemas.microsoft.com/office/word/2010/wordprocessingShape">
-                    <wps:wsp>
-                      <wps:cNvSpPr txBox="1">
-                        <a:spLocks/>
-                      </wps:cNvSpPr>
-                      <wps:spPr>
-                        <a:xfrm>
-                          <a:off x="0" y="0"/>
-                          <a:ext cx="165735" cy="271145"/>
-                        </a:xfrm>
-                        <a:prstGeom prst="rect">
-                          <a:avLst/>
-                        </a:prstGeom>
-                      </wps:spPr>
-                      <wps:txbx>
-                        <w:txbxContent>
-                          <w:p>
-                            <w:pPr>
-                              <w:spacing w:before="10"/>
-                              <w:ind w:left="20"/>
-                              <w:rPr>
-                                <w:sz w:val="20"/>
-                              </w:rPr>
-                            </w:pPr>
-                            <w:r>
-                              <w:rPr>
-                                <w:spacing w:val="-4"/>
-                                <w:sz w:val="20"/>
-                              </w:rPr>
-                              <w:t>Wall</w:t>
-                            </w:r>
-                          </w:p>
-                        </w:txbxContent>
-                      </wps:txbx>
-                      <wps:bodyPr vert="vert" wrap="square" lIns="0" tIns="0" rIns="0" bIns="0" rtlCol="0">
-                        <a:noAutofit/>
-                      </wps:bodyPr>
-                    </wps:wsp>
-                  </a:graphicData>
-                </a:graphic>
-              </wp:anchor>
-            </w:drawing>
-          </mc:Choice>
-          <mc:Fallback>
-            <w:pict>
-              <v:shapetype w14:anchorId="0D972647" id="_x0000_t202" coordsize="21600,21600" o:spt="202" path="m,l,21600r21600,l21600,xe">
-                <v:stroke joinstyle="miter"/>
-                <v:path gradientshapeok="t" o:connecttype="rect"/>
-              </v:shapetype>
-              <v:shape id="Textbox 28" o:spid="_x0000_s1026" type="#_x0000_t202" style="position:absolute;left:0;text-align:left;margin-left:570.6pt;margin-top:115.15pt;width:13.05pt;height:21.35pt;z-index:15733760;visibility:visible;mso-wrap-style:square;mso-wrap-distance-left:0;mso-wrap-distance-top:0;mso-wrap-distance-right:0;mso-wrap-distance-bottom:0;mso-position-horizontal:absolute;mso-position-horizontal-relative:page;mso-position-vertical:absolute;mso-position-vertical-relative:page;v-text-anchor:top" o:gfxdata="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" filled="f" stroked="f">
-                <v:textbox style="layout-flow:vertical" inset="0,0,0,0">
-                  <w:txbxContent>
-                    <w:p>
-                      <w:pPr>
-                        <w:spacing w:before="10"/>
-                        <w:ind w:left="20"/>
-                        <w:rPr>
-                          <w:sz w:val="20"/>
-                        </w:rPr>
-                      </w:pPr>
-                      <w:r>
-                        <w:rPr>
-                          <w:spacing w:val="-4"/>
-                          <w:sz w:val="20"/>
-                        </w:rPr>
-                        <w:t>Wall</w:t>
-                      </w:r>
-                    </w:p>
-                  </w:txbxContent>
-                </v:textbox>
-                <w10:wrap anchorx="page" anchory="page"/>
-              </v:shape>
-            </w:pict>
-          </mc:Fallback>
-        </mc:AlternateContent>
-      </w:r>
-      <w:r>
-        <w:rPr>
-          <w:spacing w:val="-4"/>
-        </w:rPr>
-        <w:t>Wall</w:t>
-      </w:r>
-    </w:p>
-    <w:p>
-      <w:pPr>
-        <w:spacing w:before="16"/>
-        <w:rPr>
-          <w:sz w:val="15"/>
-        </w:rPr>
-      </w:pPr>
-    </w:p>
     <w:p>
       <w:r>
         <w:rPr>

</xml_diff>